<commit_message>
Test: Add Test Kitchen configuration and integration tests
</commit_message>
<xml_diff>
--- a/Informe.docx
+++ b/Informe.docx
@@ -47,28 +47,12 @@
           <w:szCs w:val="28"/>
           <w:lang w:val="es-ES"/>
         </w:rPr>
-        <w:t>Grupo 6</w:t>
-      </w:r>
-      <w:r>
-        <w:rPr>
-          <w:sz w:val="28"/>
-          <w:szCs w:val="28"/>
-          <w:lang w:val="es-ES"/>
-        </w:rPr>
-        <w:t>:</w:t>
-      </w:r>
-      <w:r>
-        <w:rPr>
-          <w:sz w:val="28"/>
-          <w:szCs w:val="28"/>
-          <w:lang w:val="es-ES"/>
-        </w:rPr>
-        <w:t xml:space="preserve"> </w:t>
-      </w:r>
-    </w:p>
-    <w:p>
-      <w:pPr>
-        <w:pStyle w:val="ListParagraph"/>
+        <w:t xml:space="preserve">Grupo 6: </w:t>
+      </w:r>
+    </w:p>
+    <w:p>
+      <w:pPr>
+        <w:pStyle w:val="Prrafodelista"/>
         <w:numPr>
           <w:ilvl w:val="0"/>
           <w:numId w:val="4"/>
@@ -90,7 +74,7 @@
     </w:p>
     <w:p>
       <w:pPr>
-        <w:pStyle w:val="ListParagraph"/>
+        <w:pStyle w:val="Prrafodelista"/>
         <w:numPr>
           <w:ilvl w:val="0"/>
           <w:numId w:val="4"/>
@@ -112,7 +96,7 @@
     </w:p>
     <w:p>
       <w:pPr>
-        <w:pStyle w:val="ListParagraph"/>
+        <w:pStyle w:val="Prrafodelista"/>
         <w:numPr>
           <w:ilvl w:val="0"/>
           <w:numId w:val="4"/>
@@ -134,7 +118,7 @@
     </w:p>
     <w:p>
       <w:pPr>
-        <w:pStyle w:val="ListParagraph"/>
+        <w:pStyle w:val="Prrafodelista"/>
         <w:numPr>
           <w:ilvl w:val="0"/>
           <w:numId w:val="4"/>
@@ -156,7 +140,7 @@
     </w:p>
     <w:p>
       <w:pPr>
-        <w:pStyle w:val="ListParagraph"/>
+        <w:pStyle w:val="Prrafodelista"/>
         <w:numPr>
           <w:ilvl w:val="0"/>
           <w:numId w:val="4"/>
@@ -173,7 +157,7 @@
           <w:szCs w:val="28"/>
           <w:lang w:val="es-ES"/>
         </w:rPr>
-        <w:t>5</w:t>
+        <w:t>Herson Mena Mora</w:t>
       </w:r>
     </w:p>
     <w:p>
@@ -209,7 +193,7 @@
       <w:sdtContent>
         <w:p>
           <w:pPr>
-            <w:pStyle w:val="TOCHeading"/>
+            <w:pStyle w:val="TtuloTDC"/>
             <w:rPr>
               <w:rFonts w:ascii="Arial" w:hAnsi="Arial" w:cs="Arial"/>
               <w:sz w:val="22"/>
@@ -227,13 +211,14 @@
         </w:p>
         <w:p>
           <w:pPr>
-            <w:pStyle w:val="TOC1"/>
+            <w:pStyle w:val="TDC1"/>
             <w:tabs>
               <w:tab w:val="right" w:leader="dot" w:pos="9350"/>
             </w:tabs>
             <w:rPr>
               <w:rFonts w:eastAsiaTheme="minorEastAsia"/>
               <w:noProof/>
+              <w:lang w:val="es-CR" w:eastAsia="es-CR"/>
             </w:rPr>
           </w:pPr>
           <w:r>
@@ -260,10 +245,10 @@
             </w:rPr>
             <w:fldChar w:fldCharType="separate"/>
           </w:r>
-          <w:hyperlink w:anchor="_Toc228225570" w:history="1">
-            <w:r>
-              <w:rPr>
-                <w:rStyle w:val="Hyperlink"/>
+          <w:hyperlink w:anchor="_Toc228708936" w:history="1">
+            <w:r>
+              <w:rPr>
+                <w:rStyle w:val="Hipervnculo"/>
                 <w:noProof/>
                 <w:lang w:val="es-HN"/>
               </w:rPr>
@@ -288,7 +273,7 @@
                 <w:noProof/>
                 <w:webHidden/>
               </w:rPr>
-              <w:instrText xml:space="preserve"> PAGEREF _Toc228225570 \h </w:instrText>
+              <w:instrText xml:space="preserve"> PAGEREF _Toc228708936 \h </w:instrText>
             </w:r>
             <w:r>
               <w:rPr>
@@ -321,19 +306,20 @@
         </w:p>
         <w:p>
           <w:pPr>
-            <w:pStyle w:val="TOC1"/>
+            <w:pStyle w:val="TDC1"/>
             <w:tabs>
               <w:tab w:val="right" w:leader="dot" w:pos="9350"/>
             </w:tabs>
             <w:rPr>
               <w:rFonts w:eastAsiaTheme="minorEastAsia"/>
               <w:noProof/>
+              <w:lang w:val="es-CR" w:eastAsia="es-CR"/>
             </w:rPr>
           </w:pPr>
-          <w:hyperlink w:anchor="_Toc228225571" w:history="1">
-            <w:r>
-              <w:rPr>
-                <w:rStyle w:val="Hyperlink"/>
+          <w:hyperlink w:anchor="_Toc228708937" w:history="1">
+            <w:r>
+              <w:rPr>
+                <w:rStyle w:val="Hipervnculo"/>
                 <w:noProof/>
                 <w:lang w:val="es-HN"/>
               </w:rPr>
@@ -358,7 +344,7 @@
                 <w:noProof/>
                 <w:webHidden/>
               </w:rPr>
-              <w:instrText xml:space="preserve"> PAGEREF _Toc228225571 \h </w:instrText>
+              <w:instrText xml:space="preserve"> PAGEREF _Toc228708937 \h </w:instrText>
             </w:r>
             <w:r>
               <w:rPr>
@@ -391,23 +377,24 @@
         </w:p>
         <w:p>
           <w:pPr>
-            <w:pStyle w:val="TOC1"/>
+            <w:pStyle w:val="TDC1"/>
             <w:tabs>
               <w:tab w:val="right" w:leader="dot" w:pos="9350"/>
             </w:tabs>
             <w:rPr>
               <w:rFonts w:eastAsiaTheme="minorEastAsia"/>
               <w:noProof/>
+              <w:lang w:val="es-CR" w:eastAsia="es-CR"/>
             </w:rPr>
           </w:pPr>
-          <w:hyperlink w:anchor="_Toc228225572" w:history="1">
-            <w:r>
-              <w:rPr>
-                <w:rStyle w:val="Hyperlink"/>
+          <w:hyperlink w:anchor="_Toc228708938" w:history="1">
+            <w:r>
+              <w:rPr>
+                <w:rStyle w:val="Hipervnculo"/>
                 <w:noProof/>
                 <w:lang w:val="es-HN"/>
               </w:rPr>
-              <w:t>Cheft/Cookbooks</w:t>
+              <w:t>Chef/Cookbooks</w:t>
             </w:r>
             <w:r>
               <w:rPr>
@@ -428,7 +415,7 @@
                 <w:noProof/>
                 <w:webHidden/>
               </w:rPr>
-              <w:instrText xml:space="preserve"> PAGEREF _Toc228225572 \h </w:instrText>
+              <w:instrText xml:space="preserve"> PAGEREF _Toc228708938 \h </w:instrText>
             </w:r>
             <w:r>
               <w:rPr>
@@ -461,19 +448,20 @@
         </w:p>
         <w:p>
           <w:pPr>
-            <w:pStyle w:val="TOC2"/>
+            <w:pStyle w:val="TDC2"/>
             <w:tabs>
               <w:tab w:val="right" w:leader="dot" w:pos="9350"/>
             </w:tabs>
             <w:rPr>
               <w:rFonts w:eastAsiaTheme="minorEastAsia"/>
               <w:noProof/>
+              <w:lang w:val="es-CR" w:eastAsia="es-CR"/>
             </w:rPr>
           </w:pPr>
-          <w:hyperlink w:anchor="_Toc228225573" w:history="1">
-            <w:r>
-              <w:rPr>
-                <w:rStyle w:val="Hyperlink"/>
+          <w:hyperlink w:anchor="_Toc228708939" w:history="1">
+            <w:r>
+              <w:rPr>
+                <w:rStyle w:val="Hipervnculo"/>
                 <w:noProof/>
                 <w:lang w:val="es-HN"/>
               </w:rPr>
@@ -498,7 +486,7 @@
                 <w:noProof/>
                 <w:webHidden/>
               </w:rPr>
-              <w:instrText xml:space="preserve"> PAGEREF _Toc228225573 \h </w:instrText>
+              <w:instrText xml:space="preserve"> PAGEREF _Toc228708939 \h </w:instrText>
             </w:r>
             <w:r>
               <w:rPr>
@@ -531,19 +519,20 @@
         </w:p>
         <w:p>
           <w:pPr>
-            <w:pStyle w:val="TOC2"/>
+            <w:pStyle w:val="TDC2"/>
             <w:tabs>
               <w:tab w:val="right" w:leader="dot" w:pos="9350"/>
             </w:tabs>
             <w:rPr>
               <w:rFonts w:eastAsiaTheme="minorEastAsia"/>
               <w:noProof/>
+              <w:lang w:val="es-CR" w:eastAsia="es-CR"/>
             </w:rPr>
           </w:pPr>
-          <w:hyperlink w:anchor="_Toc228225574" w:history="1">
-            <w:r>
-              <w:rPr>
-                <w:rStyle w:val="Hyperlink"/>
+          <w:hyperlink w:anchor="_Toc228708940" w:history="1">
+            <w:r>
+              <w:rPr>
+                <w:rStyle w:val="Hipervnculo"/>
                 <w:noProof/>
                 <w:lang w:val="es-HN"/>
               </w:rPr>
@@ -568,7 +557,7 @@
                 <w:noProof/>
                 <w:webHidden/>
               </w:rPr>
-              <w:instrText xml:space="preserve"> PAGEREF _Toc228225574 \h </w:instrText>
+              <w:instrText xml:space="preserve"> PAGEREF _Toc228708940 \h </w:instrText>
             </w:r>
             <w:r>
               <w:rPr>
@@ -601,19 +590,20 @@
         </w:p>
         <w:p>
           <w:pPr>
-            <w:pStyle w:val="TOC2"/>
+            <w:pStyle w:val="TDC2"/>
             <w:tabs>
               <w:tab w:val="right" w:leader="dot" w:pos="9350"/>
             </w:tabs>
             <w:rPr>
               <w:rFonts w:eastAsiaTheme="minorEastAsia"/>
               <w:noProof/>
+              <w:lang w:val="es-CR" w:eastAsia="es-CR"/>
             </w:rPr>
           </w:pPr>
-          <w:hyperlink w:anchor="_Toc228225575" w:history="1">
-            <w:r>
-              <w:rPr>
-                <w:rStyle w:val="Hyperlink"/>
+          <w:hyperlink w:anchor="_Toc228708941" w:history="1">
+            <w:r>
+              <w:rPr>
+                <w:rStyle w:val="Hipervnculo"/>
                 <w:noProof/>
                 <w:lang w:val="es-HN"/>
               </w:rPr>
@@ -638,7 +628,7 @@
                 <w:noProof/>
                 <w:webHidden/>
               </w:rPr>
-              <w:instrText xml:space="preserve"> PAGEREF _Toc228225575 \h </w:instrText>
+              <w:instrText xml:space="preserve"> PAGEREF _Toc228708941 \h </w:instrText>
             </w:r>
             <w:r>
               <w:rPr>
@@ -671,19 +661,20 @@
         </w:p>
         <w:p>
           <w:pPr>
-            <w:pStyle w:val="TOC2"/>
+            <w:pStyle w:val="TDC2"/>
             <w:tabs>
               <w:tab w:val="right" w:leader="dot" w:pos="9350"/>
             </w:tabs>
             <w:rPr>
               <w:rFonts w:eastAsiaTheme="minorEastAsia"/>
               <w:noProof/>
+              <w:lang w:val="es-CR" w:eastAsia="es-CR"/>
             </w:rPr>
           </w:pPr>
-          <w:hyperlink w:anchor="_Toc228225576" w:history="1">
-            <w:r>
-              <w:rPr>
-                <w:rStyle w:val="Hyperlink"/>
+          <w:hyperlink w:anchor="_Toc228708942" w:history="1">
+            <w:r>
+              <w:rPr>
+                <w:rStyle w:val="Hipervnculo"/>
                 <w:noProof/>
                 <w:lang w:val="es-HN"/>
               </w:rPr>
@@ -708,7 +699,7 @@
                 <w:noProof/>
                 <w:webHidden/>
               </w:rPr>
-              <w:instrText xml:space="preserve"> PAGEREF _Toc228225576 \h </w:instrText>
+              <w:instrText xml:space="preserve"> PAGEREF _Toc228708942 \h </w:instrText>
             </w:r>
             <w:r>
               <w:rPr>
@@ -741,19 +732,20 @@
         </w:p>
         <w:p>
           <w:pPr>
-            <w:pStyle w:val="TOC2"/>
+            <w:pStyle w:val="TDC2"/>
             <w:tabs>
               <w:tab w:val="right" w:leader="dot" w:pos="9350"/>
             </w:tabs>
             <w:rPr>
               <w:rFonts w:eastAsiaTheme="minorEastAsia"/>
               <w:noProof/>
+              <w:lang w:val="es-CR" w:eastAsia="es-CR"/>
             </w:rPr>
           </w:pPr>
-          <w:hyperlink w:anchor="_Toc228225577" w:history="1">
-            <w:r>
-              <w:rPr>
-                <w:rStyle w:val="Hyperlink"/>
+          <w:hyperlink w:anchor="_Toc228708943" w:history="1">
+            <w:r>
+              <w:rPr>
+                <w:rStyle w:val="Hipervnculo"/>
                 <w:noProof/>
                 <w:lang w:val="es-HN"/>
               </w:rPr>
@@ -778,7 +770,7 @@
                 <w:noProof/>
                 <w:webHidden/>
               </w:rPr>
-              <w:instrText xml:space="preserve"> PAGEREF _Toc228225577 \h </w:instrText>
+              <w:instrText xml:space="preserve"> PAGEREF _Toc228708943 \h </w:instrText>
             </w:r>
             <w:r>
               <w:rPr>
@@ -811,19 +803,20 @@
         </w:p>
         <w:p>
           <w:pPr>
-            <w:pStyle w:val="TOC2"/>
+            <w:pStyle w:val="TDC2"/>
             <w:tabs>
               <w:tab w:val="right" w:leader="dot" w:pos="9350"/>
             </w:tabs>
             <w:rPr>
               <w:rFonts w:eastAsiaTheme="minorEastAsia"/>
               <w:noProof/>
+              <w:lang w:val="es-CR" w:eastAsia="es-CR"/>
             </w:rPr>
           </w:pPr>
-          <w:hyperlink w:anchor="_Toc228225578" w:history="1">
-            <w:r>
-              <w:rPr>
-                <w:rStyle w:val="Hyperlink"/>
+          <w:hyperlink w:anchor="_Toc228708944" w:history="1">
+            <w:r>
+              <w:rPr>
+                <w:rStyle w:val="Hipervnculo"/>
                 <w:noProof/>
                 <w:lang w:val="es-ES"/>
               </w:rPr>
@@ -848,7 +841,228 @@
                 <w:noProof/>
                 <w:webHidden/>
               </w:rPr>
-              <w:instrText xml:space="preserve"> PAGEREF _Toc228225578 \h </w:instrText>
+              <w:instrText xml:space="preserve"> PAGEREF _Toc228708944 \h </w:instrText>
+            </w:r>
+            <w:r>
+              <w:rPr>
+                <w:noProof/>
+                <w:webHidden/>
+              </w:rPr>
+            </w:r>
+            <w:r>
+              <w:rPr>
+                <w:noProof/>
+                <w:webHidden/>
+              </w:rPr>
+              <w:fldChar w:fldCharType="separate"/>
+            </w:r>
+            <w:r>
+              <w:rPr>
+                <w:noProof/>
+                <w:webHidden/>
+              </w:rPr>
+              <w:t>4</w:t>
+            </w:r>
+            <w:r>
+              <w:rPr>
+                <w:noProof/>
+                <w:webHidden/>
+              </w:rPr>
+              <w:fldChar w:fldCharType="end"/>
+            </w:r>
+          </w:hyperlink>
+        </w:p>
+        <w:p>
+          <w:pPr>
+            <w:pStyle w:val="TDC1"/>
+            <w:tabs>
+              <w:tab w:val="right" w:leader="dot" w:pos="9350"/>
+            </w:tabs>
+            <w:rPr>
+              <w:rFonts w:eastAsiaTheme="minorEastAsia"/>
+              <w:noProof/>
+              <w:lang w:val="es-CR" w:eastAsia="es-CR"/>
+            </w:rPr>
+          </w:pPr>
+          <w:hyperlink w:anchor="_Toc228708945" w:history="1">
+            <w:r>
+              <w:rPr>
+                <w:rStyle w:val="Hipervnculo"/>
+                <w:noProof/>
+                <w:lang w:val="es-HN"/>
+              </w:rPr>
+              <w:t>Pruebas automatizadas</w:t>
+            </w:r>
+            <w:r>
+              <w:rPr>
+                <w:noProof/>
+                <w:webHidden/>
+              </w:rPr>
+              <w:tab/>
+            </w:r>
+            <w:r>
+              <w:rPr>
+                <w:noProof/>
+                <w:webHidden/>
+              </w:rPr>
+              <w:fldChar w:fldCharType="begin"/>
+            </w:r>
+            <w:r>
+              <w:rPr>
+                <w:noProof/>
+                <w:webHidden/>
+              </w:rPr>
+              <w:instrText xml:space="preserve"> PAGEREF _Toc228708945 \h </w:instrText>
+            </w:r>
+            <w:r>
+              <w:rPr>
+                <w:noProof/>
+                <w:webHidden/>
+              </w:rPr>
+            </w:r>
+            <w:r>
+              <w:rPr>
+                <w:noProof/>
+                <w:webHidden/>
+              </w:rPr>
+              <w:fldChar w:fldCharType="separate"/>
+            </w:r>
+            <w:r>
+              <w:rPr>
+                <w:noProof/>
+                <w:webHidden/>
+              </w:rPr>
+              <w:t>4</w:t>
+            </w:r>
+            <w:r>
+              <w:rPr>
+                <w:noProof/>
+                <w:webHidden/>
+              </w:rPr>
+              <w:fldChar w:fldCharType="end"/>
+            </w:r>
+          </w:hyperlink>
+        </w:p>
+        <w:p>
+          <w:pPr>
+            <w:pStyle w:val="TDC2"/>
+            <w:tabs>
+              <w:tab w:val="right" w:leader="dot" w:pos="9350"/>
+            </w:tabs>
+            <w:rPr>
+              <w:rFonts w:eastAsiaTheme="minorEastAsia"/>
+              <w:noProof/>
+              <w:lang w:val="es-CR" w:eastAsia="es-CR"/>
+            </w:rPr>
+          </w:pPr>
+          <w:hyperlink w:anchor="_Toc228708946" w:history="1">
+            <w:r>
+              <w:rPr>
+                <w:rStyle w:val="Hipervnculo"/>
+                <w:noProof/>
+                <w:lang w:val="es-HN"/>
+              </w:rPr>
+              <w:t>Pruebas unitarias</w:t>
+            </w:r>
+            <w:r>
+              <w:rPr>
+                <w:noProof/>
+                <w:webHidden/>
+              </w:rPr>
+              <w:tab/>
+            </w:r>
+            <w:r>
+              <w:rPr>
+                <w:noProof/>
+                <w:webHidden/>
+              </w:rPr>
+              <w:fldChar w:fldCharType="begin"/>
+            </w:r>
+            <w:r>
+              <w:rPr>
+                <w:noProof/>
+                <w:webHidden/>
+              </w:rPr>
+              <w:instrText xml:space="preserve"> PAGEREF _Toc228708946 \h </w:instrText>
+            </w:r>
+            <w:r>
+              <w:rPr>
+                <w:noProof/>
+                <w:webHidden/>
+              </w:rPr>
+            </w:r>
+            <w:r>
+              <w:rPr>
+                <w:noProof/>
+                <w:webHidden/>
+              </w:rPr>
+              <w:fldChar w:fldCharType="separate"/>
+            </w:r>
+            <w:r>
+              <w:rPr>
+                <w:noProof/>
+                <w:webHidden/>
+              </w:rPr>
+              <w:t>4</w:t>
+            </w:r>
+            <w:r>
+              <w:rPr>
+                <w:noProof/>
+                <w:webHidden/>
+              </w:rPr>
+              <w:fldChar w:fldCharType="end"/>
+            </w:r>
+          </w:hyperlink>
+        </w:p>
+        <w:p>
+          <w:pPr>
+            <w:pStyle w:val="TDC2"/>
+            <w:tabs>
+              <w:tab w:val="right" w:leader="dot" w:pos="9350"/>
+            </w:tabs>
+            <w:rPr>
+              <w:rFonts w:eastAsiaTheme="minorEastAsia"/>
+              <w:noProof/>
+              <w:lang w:val="es-CR" w:eastAsia="es-CR"/>
+            </w:rPr>
+          </w:pPr>
+          <w:hyperlink w:anchor="_Toc228708947" w:history="1">
+            <w:r>
+              <w:rPr>
+                <w:rStyle w:val="Hipervnculo"/>
+                <w:noProof/>
+                <w:lang w:val="es-HN"/>
+              </w:rPr>
+              <w:t>Pruebas de integraci</w:t>
+            </w:r>
+            <w:r>
+              <w:rPr>
+                <w:rStyle w:val="Hipervnculo"/>
+                <w:noProof/>
+                <w:lang w:val="es-CR"/>
+              </w:rPr>
+              <w:t>ón</w:t>
+            </w:r>
+            <w:r>
+              <w:rPr>
+                <w:noProof/>
+                <w:webHidden/>
+              </w:rPr>
+              <w:tab/>
+            </w:r>
+            <w:r>
+              <w:rPr>
+                <w:noProof/>
+                <w:webHidden/>
+              </w:rPr>
+              <w:fldChar w:fldCharType="begin"/>
+            </w:r>
+            <w:r>
+              <w:rPr>
+                <w:noProof/>
+                <w:webHidden/>
+              </w:rPr>
+              <w:instrText xml:space="preserve"> PAGEREF _Toc228708947 \h </w:instrText>
             </w:r>
             <w:r>
               <w:rPr>
@@ -957,17 +1171,16 @@
     </w:p>
     <w:p>
       <w:pPr>
-        <w:pStyle w:val="Heading1"/>
-        <w:rPr>
-          <w:lang w:val="es-HN"/>
-        </w:rPr>
-      </w:pPr>
-      <w:bookmarkStart w:id="0" w:name="_Toc228225570"/>
-      <w:r>
-        <w:rPr>
-          <w:lang w:val="es-HN"/>
-        </w:rPr>
-        <w:lastRenderedPageBreak/>
+        <w:pStyle w:val="Ttulo1"/>
+        <w:rPr>
+          <w:lang w:val="es-HN"/>
+        </w:rPr>
+      </w:pPr>
+      <w:bookmarkStart w:id="0" w:name="_Toc228708936"/>
+      <w:r>
+        <w:rPr>
+          <w:lang w:val="es-HN"/>
+        </w:rPr>
         <w:t>Estructura del proyecto</w:t>
       </w:r>
       <w:bookmarkEnd w:id="0"/>
@@ -980,6 +1193,7 @@
       </w:pPr>
       <w:r>
         <w:rPr>
+          <w:noProof/>
           <w:lang w:val="es-HN"/>
         </w:rPr>
         <w:drawing>
@@ -1021,6 +1235,7 @@
     </w:p>
     <w:p>
       <w:pPr>
+        <w:jc w:val="both"/>
         <w:rPr>
           <w:lang w:val="es-HN"/>
         </w:rPr>
@@ -1043,57 +1258,28 @@
         <w:rPr>
           <w:lang w:val="es-HN"/>
         </w:rPr>
-        <w:t xml:space="preserve"> en su Raiz que sirve para crear las maquinas virtuales necesarias para correr las recetas de </w:t>
-      </w:r>
-      <w:proofErr w:type="spellStart"/>
-      <w:r>
-        <w:rPr>
-          <w:lang w:val="es-HN"/>
-        </w:rPr>
-        <w:t>Cheft</w:t>
-      </w:r>
-      <w:proofErr w:type="spellEnd"/>
-      <w:r>
-        <w:rPr>
-          <w:lang w:val="es-HN"/>
-        </w:rPr>
-        <w:t>.</w:t>
-      </w:r>
-    </w:p>
-    <w:p>
-      <w:pPr>
-        <w:rPr>
-          <w:lang w:val="es-HN"/>
-        </w:rPr>
-      </w:pPr>
-      <w:r>
-        <w:rPr>
-          <w:lang w:val="es-HN"/>
-        </w:rPr>
-        <w:t xml:space="preserve">En la carpeta </w:t>
-      </w:r>
-      <w:proofErr w:type="spellStart"/>
-      <w:r>
-        <w:rPr>
-          <w:lang w:val="es-HN"/>
-        </w:rPr>
-        <w:t>Cheft</w:t>
-      </w:r>
-      <w:proofErr w:type="spellEnd"/>
-      <w:r>
-        <w:rPr>
-          <w:lang w:val="es-HN"/>
-        </w:rPr>
-        <w:t xml:space="preserve"> </w:t>
-      </w:r>
-      <w:proofErr w:type="gramStart"/>
-      <w:r>
-        <w:rPr>
-          <w:lang w:val="es-HN"/>
-        </w:rPr>
-        <w:t>la recetas</w:t>
-      </w:r>
-      <w:proofErr w:type="gramEnd"/>
+        <w:t xml:space="preserve"> en su Raiz que sirve para crear las maquinas virtuales necesarias para correr las recetas de Chef.</w:t>
+      </w:r>
+    </w:p>
+    <w:p>
+      <w:pPr>
+        <w:jc w:val="both"/>
+        <w:rPr>
+          <w:lang w:val="es-HN"/>
+        </w:rPr>
+      </w:pPr>
+      <w:r>
+        <w:rPr>
+          <w:lang w:val="es-HN"/>
+        </w:rPr>
+        <w:t xml:space="preserve">En la carpeta Chef </w:t>
+      </w:r>
+      <w:r>
+        <w:rPr>
+          <w:lang w:val="es-HN"/>
+        </w:rPr>
+        <w:t>las recetas</w:t>
+      </w:r>
       <w:r>
         <w:rPr>
           <w:lang w:val="es-HN"/>
@@ -1103,12 +1289,12 @@
     </w:p>
     <w:p>
       <w:pPr>
-        <w:pStyle w:val="Heading1"/>
-        <w:rPr>
-          <w:lang w:val="es-HN"/>
-        </w:rPr>
-      </w:pPr>
-      <w:bookmarkStart w:id="1" w:name="_Toc228225571"/>
+        <w:pStyle w:val="Ttulo1"/>
+        <w:rPr>
+          <w:lang w:val="es-HN"/>
+        </w:rPr>
+      </w:pPr>
+      <w:bookmarkStart w:id="1" w:name="_Toc228708937"/>
       <w:proofErr w:type="spellStart"/>
       <w:r>
         <w:rPr>
@@ -1128,26 +1314,18 @@
     </w:p>
     <w:p>
       <w:pPr>
-        <w:pStyle w:val="Heading1"/>
-        <w:rPr>
-          <w:lang w:val="es-HN"/>
-        </w:rPr>
-      </w:pPr>
-      <w:bookmarkStart w:id="2" w:name="_Toc228225572"/>
-      <w:proofErr w:type="spellStart"/>
+        <w:pStyle w:val="Ttulo1"/>
+        <w:rPr>
+          <w:lang w:val="es-HN"/>
+        </w:rPr>
+      </w:pPr>
+      <w:bookmarkStart w:id="2" w:name="_Toc228708938"/>
       <w:r>
         <w:rPr>
           <w:lang w:val="es-HN"/>
         </w:rPr>
         <w:lastRenderedPageBreak/>
-        <w:t>Cheft</w:t>
-      </w:r>
-      <w:proofErr w:type="spellEnd"/>
-      <w:r>
-        <w:rPr>
-          <w:lang w:val="es-HN"/>
-        </w:rPr>
-        <w:t>/</w:t>
+        <w:t>Chef/</w:t>
       </w:r>
       <w:proofErr w:type="spellStart"/>
       <w:r>
@@ -1161,12 +1339,12 @@
     </w:p>
     <w:p>
       <w:pPr>
-        <w:pStyle w:val="Heading2"/>
-        <w:rPr>
-          <w:lang w:val="es-HN"/>
-        </w:rPr>
-      </w:pPr>
-      <w:bookmarkStart w:id="3" w:name="_Toc228225573"/>
+        <w:pStyle w:val="Ttulo2"/>
+        <w:rPr>
+          <w:lang w:val="es-HN"/>
+        </w:rPr>
+      </w:pPr>
+      <w:bookmarkStart w:id="3" w:name="_Toc228708939"/>
       <w:r>
         <w:rPr>
           <w:lang w:val="es-HN"/>
@@ -1177,12 +1355,12 @@
     </w:p>
     <w:p>
       <w:pPr>
-        <w:pStyle w:val="Heading2"/>
-        <w:rPr>
-          <w:lang w:val="es-HN"/>
-        </w:rPr>
-      </w:pPr>
-      <w:bookmarkStart w:id="4" w:name="_Toc228225574"/>
+        <w:pStyle w:val="Ttulo2"/>
+        <w:rPr>
+          <w:lang w:val="es-HN"/>
+        </w:rPr>
+      </w:pPr>
+      <w:bookmarkStart w:id="4" w:name="_Toc228708940"/>
       <w:proofErr w:type="spellStart"/>
       <w:r>
         <w:rPr>
@@ -1195,72 +1373,54 @@
     </w:p>
     <w:p>
       <w:pPr>
-        <w:pStyle w:val="Heading2"/>
-        <w:rPr>
-          <w:lang w:val="es-HN"/>
-        </w:rPr>
-      </w:pPr>
-      <w:bookmarkStart w:id="5" w:name="_Toc228225575"/>
+        <w:pStyle w:val="Ttulo2"/>
+        <w:rPr>
+          <w:lang w:val="es-HN"/>
+        </w:rPr>
+      </w:pPr>
+      <w:bookmarkStart w:id="5" w:name="_Toc228708941"/>
       <w:proofErr w:type="spellStart"/>
       <w:r>
         <w:rPr>
           <w:lang w:val="es-HN"/>
         </w:rPr>
-        <w:t>Mi_</w:t>
-      </w:r>
-      <w:r>
-        <w:rPr>
-          <w:lang w:val="es-HN"/>
-        </w:rPr>
-        <w:t>mysql</w:t>
+        <w:t>Mi_mysql</w:t>
       </w:r>
       <w:bookmarkEnd w:id="5"/>
       <w:proofErr w:type="spellEnd"/>
     </w:p>
     <w:p>
       <w:pPr>
-        <w:pStyle w:val="Heading2"/>
-        <w:rPr>
-          <w:lang w:val="es-HN"/>
-        </w:rPr>
-      </w:pPr>
-      <w:bookmarkStart w:id="6" w:name="_Toc228225576"/>
+        <w:pStyle w:val="Ttulo2"/>
+        <w:rPr>
+          <w:lang w:val="es-HN"/>
+        </w:rPr>
+      </w:pPr>
+      <w:bookmarkStart w:id="6" w:name="_Toc228708942"/>
       <w:proofErr w:type="spellStart"/>
       <w:r>
         <w:rPr>
           <w:lang w:val="es-HN"/>
         </w:rPr>
-        <w:t>Mi_</w:t>
-      </w:r>
-      <w:r>
-        <w:rPr>
-          <w:lang w:val="es-HN"/>
-        </w:rPr>
-        <w:t>php</w:t>
+        <w:t>Mi_php</w:t>
       </w:r>
       <w:bookmarkEnd w:id="6"/>
       <w:proofErr w:type="spellEnd"/>
     </w:p>
     <w:p>
       <w:pPr>
-        <w:pStyle w:val="Heading2"/>
-        <w:rPr>
-          <w:lang w:val="es-HN"/>
-        </w:rPr>
-      </w:pPr>
-      <w:bookmarkStart w:id="7" w:name="_Toc228225577"/>
+        <w:pStyle w:val="Ttulo2"/>
+        <w:rPr>
+          <w:lang w:val="es-HN"/>
+        </w:rPr>
+      </w:pPr>
+      <w:bookmarkStart w:id="7" w:name="_Toc228708943"/>
       <w:proofErr w:type="spellStart"/>
       <w:r>
         <w:rPr>
           <w:lang w:val="es-HN"/>
         </w:rPr>
-        <w:t>Mi_</w:t>
-      </w:r>
-      <w:r>
-        <w:rPr>
-          <w:lang w:val="es-HN"/>
-        </w:rPr>
-        <w:t>wordpress</w:t>
+        <w:t>Mi_wordpress</w:t>
       </w:r>
       <w:bookmarkEnd w:id="7"/>
       <w:proofErr w:type="spellEnd"/>
@@ -1273,6 +1433,7 @@
       </w:pPr>
       <w:r>
         <w:rPr>
+          <w:noProof/>
           <w:lang w:val="es-HN"/>
         </w:rPr>
         <w:drawing>
@@ -1327,6 +1488,7 @@
     </w:p>
     <w:p>
       <w:pPr>
+        <w:jc w:val="both"/>
         <w:rPr>
           <w:lang w:val="es-HN"/>
         </w:rPr>
@@ -1368,9 +1530,16 @@
         </w:rPr>
         <w:t xml:space="preserve"> para correr un comando en la Shell en este caso descargar el archivo par a instalar WordPress</w:t>
       </w:r>
-    </w:p>
-    <w:p>
-      <w:pPr>
+      <w:r>
+        <w:rPr>
+          <w:lang w:val="es-HN"/>
+        </w:rPr>
+        <w:t>.</w:t>
+      </w:r>
+    </w:p>
+    <w:p>
+      <w:pPr>
+        <w:jc w:val="both"/>
         <w:rPr>
           <w:lang w:val="es-HN"/>
         </w:rPr>
@@ -1384,6 +1553,7 @@
     </w:p>
     <w:p>
       <w:pPr>
+        <w:jc w:val="both"/>
         <w:rPr>
           <w:lang w:val="es-ES"/>
         </w:rPr>
@@ -1453,6 +1623,7 @@
     </w:p>
     <w:p>
       <w:pPr>
+        <w:jc w:val="both"/>
         <w:rPr>
           <w:lang w:val="es-ES"/>
         </w:rPr>
@@ -1493,6 +1664,12 @@
         <w:t>wordpress</w:t>
       </w:r>
       <w:proofErr w:type="spellEnd"/>
+      <w:r>
+        <w:rPr>
+          <w:lang w:val="es-ES"/>
+        </w:rPr>
+        <w:t>.</w:t>
+      </w:r>
     </w:p>
     <w:p>
       <w:pPr>
@@ -1505,12 +1682,12 @@
     </w:p>
     <w:p>
       <w:pPr>
-        <w:pStyle w:val="Heading2"/>
-        <w:rPr>
-          <w:lang w:val="es-ES"/>
-        </w:rPr>
-      </w:pPr>
-      <w:bookmarkStart w:id="8" w:name="_Toc228225578"/>
+        <w:pStyle w:val="Ttulo2"/>
+        <w:rPr>
+          <w:lang w:val="es-ES"/>
+        </w:rPr>
+      </w:pPr>
+      <w:bookmarkStart w:id="8" w:name="_Toc228708944"/>
       <w:r>
         <w:rPr>
           <w:lang w:val="es-ES"/>
@@ -1521,6 +1698,7 @@
     </w:p>
     <w:p>
       <w:pPr>
+        <w:jc w:val="both"/>
         <w:rPr>
           <w:lang w:val="es-ES"/>
         </w:rPr>
@@ -1548,8 +1726,9 @@
     </w:p>
     <w:p>
       <w:pPr>
-        <w:rPr>
-          <w:lang w:val="es-ES"/>
+        <w:jc w:val="both"/>
+        <w:rPr>
+          <w:lang w:val="es-CR"/>
         </w:rPr>
       </w:pPr>
       <w:r>
@@ -1558,14 +1737,12 @@
         </w:rPr>
         <w:t xml:space="preserve">Al finalizar se </w:t>
       </w:r>
-      <w:proofErr w:type="gramStart"/>
-      <w:r>
-        <w:rPr>
-          <w:lang w:val="es-ES"/>
-        </w:rPr>
-        <w:t>mostrara</w:t>
-      </w:r>
-      <w:proofErr w:type="gramEnd"/>
+      <w:r>
+        <w:rPr>
+          <w:lang w:val="es-ES"/>
+        </w:rPr>
+        <w:t>mostrará</w:t>
+      </w:r>
       <w:r>
         <w:rPr>
           <w:lang w:val="es-ES"/>
@@ -1594,6 +1771,20 @@
         <w:t>Wordpress</w:t>
       </w:r>
       <w:proofErr w:type="spellEnd"/>
+      <w:r>
+        <w:rPr>
+          <w:lang w:val="es-CR"/>
+        </w:rPr>
+        <w:t>:</w:t>
+      </w:r>
+    </w:p>
+    <w:p>
+      <w:pPr>
+        <w:jc w:val="both"/>
+        <w:rPr>
+          <w:lang w:val="es-CR"/>
+        </w:rPr>
+      </w:pPr>
       <w:r>
         <w:rPr>
           <w:lang w:val="es-ES"/>
@@ -1603,7 +1794,7 @@
       <w:hyperlink r:id="rId7" w:history="1">
         <w:r>
           <w:rPr>
-            <w:rStyle w:val="Hyperlink"/>
+            <w:rStyle w:val="Hipervnculo"/>
             <w:b/>
             <w:bCs/>
             <w:lang w:val="es-ES"/>
@@ -1618,7 +1809,7 @@
         </w:r>
         <w:r>
           <w:rPr>
-            <w:rStyle w:val="Hyperlink"/>
+            <w:rStyle w:val="Hipervnculo"/>
             <w:b/>
             <w:bCs/>
             <w:lang w:val="es-ES"/>
@@ -1627,7 +1818,7 @@
         </w:r>
         <w:r>
           <w:rPr>
-            <w:rStyle w:val="Hyperlink"/>
+            <w:rStyle w:val="Hipervnculo"/>
             <w:b/>
             <w:bCs/>
             <w:lang w:val="es-ES"/>
@@ -1637,7 +1828,7 @@
         <w:proofErr w:type="spellStart"/>
         <w:r>
           <w:rPr>
-            <w:rStyle w:val="Hyperlink"/>
+            <w:rStyle w:val="Hipervnculo"/>
             <w:b/>
             <w:bCs/>
             <w:lang w:val="es-ES"/>
@@ -1653,6 +1844,958 @@
           <w:lang w:val="es-ES"/>
         </w:rPr>
       </w:pPr>
+    </w:p>
+    <w:p>
+      <w:pPr>
+        <w:pStyle w:val="Ttulo1"/>
+        <w:rPr>
+          <w:lang w:val="es-HN"/>
+        </w:rPr>
+      </w:pPr>
+      <w:bookmarkStart w:id="9" w:name="_Toc228708945"/>
+      <w:r>
+        <w:rPr>
+          <w:lang w:val="es-HN"/>
+        </w:rPr>
+        <w:t>Pruebas automatizadas</w:t>
+      </w:r>
+      <w:bookmarkEnd w:id="9"/>
+    </w:p>
+    <w:p>
+      <w:pPr>
+        <w:pStyle w:val="Ttulo2"/>
+        <w:rPr>
+          <w:lang w:val="es-HN"/>
+        </w:rPr>
+      </w:pPr>
+      <w:bookmarkStart w:id="10" w:name="_Toc228708946"/>
+      <w:r>
+        <w:rPr>
+          <w:lang w:val="es-HN"/>
+        </w:rPr>
+        <w:t>Pruebas unitarias</w:t>
+      </w:r>
+      <w:bookmarkEnd w:id="10"/>
+    </w:p>
+    <w:p>
+      <w:pPr>
+        <w:rPr>
+          <w:lang w:val="es-ES"/>
+        </w:rPr>
+      </w:pPr>
+    </w:p>
+    <w:p>
+      <w:pPr>
+        <w:pStyle w:val="Ttulo2"/>
+        <w:rPr>
+          <w:lang w:val="es-HN"/>
+        </w:rPr>
+      </w:pPr>
+      <w:bookmarkStart w:id="11" w:name="_Toc228708947"/>
+      <w:r>
+        <w:rPr>
+          <w:lang w:val="es-HN"/>
+        </w:rPr>
+        <w:t xml:space="preserve">Pruebas de </w:t>
+      </w:r>
+      <w:proofErr w:type="spellStart"/>
+      <w:r>
+        <w:rPr>
+          <w:lang w:val="es-HN"/>
+        </w:rPr>
+        <w:t>integraci</w:t>
+      </w:r>
+      <w:r>
+        <w:rPr>
+          <w:lang w:val="es-CR"/>
+        </w:rPr>
+        <w:t>ón</w:t>
+      </w:r>
+      <w:bookmarkEnd w:id="11"/>
+      <w:proofErr w:type="spellEnd"/>
+    </w:p>
+    <w:p>
+      <w:pPr>
+        <w:rPr>
+          <w:lang w:val="es-CR"/>
+        </w:rPr>
+      </w:pPr>
+      <w:r>
+        <w:rPr>
+          <w:lang w:val="es-ES"/>
+        </w:rPr>
+        <w:t xml:space="preserve">Para ser capaz de crear y completar las pruebas de </w:t>
+      </w:r>
+      <w:proofErr w:type="spellStart"/>
+      <w:r>
+        <w:rPr>
+          <w:lang w:val="es-ES"/>
+        </w:rPr>
+        <w:t>integraci</w:t>
+      </w:r>
+      <w:r>
+        <w:rPr>
+          <w:lang w:val="es-CR"/>
+        </w:rPr>
+        <w:t>ón</w:t>
+      </w:r>
+      <w:proofErr w:type="spellEnd"/>
+      <w:r>
+        <w:rPr>
+          <w:lang w:val="es-CR"/>
+        </w:rPr>
+        <w:t xml:space="preserve"> </w:t>
+      </w:r>
+      <w:r>
+        <w:rPr>
+          <w:lang w:val="es-CR"/>
+        </w:rPr>
+        <w:t>es</w:t>
+      </w:r>
+      <w:r>
+        <w:rPr>
+          <w:lang w:val="es-CR"/>
+        </w:rPr>
+        <w:t xml:space="preserve"> necesario realizar una serie de pasos</w:t>
+      </w:r>
+      <w:r>
+        <w:rPr>
+          <w:lang w:val="es-CR"/>
+        </w:rPr>
+        <w:t>:</w:t>
+      </w:r>
+    </w:p>
+    <w:p>
+      <w:pPr>
+        <w:rPr>
+          <w:lang w:val="es-CR"/>
+        </w:rPr>
+      </w:pPr>
+      <w:r>
+        <w:rPr>
+          <w:lang w:val="es-ES"/>
+        </w:rPr>
+        <w:t>Primero es necesario</w:t>
+      </w:r>
+      <w:r>
+        <w:rPr>
+          <w:lang w:val="es-ES"/>
+        </w:rPr>
+        <w:t xml:space="preserve"> crear dos </w:t>
+      </w:r>
+      <w:r>
+        <w:rPr>
+          <w:lang w:val="es-ES"/>
+        </w:rPr>
+        <w:t>ficheros</w:t>
+      </w:r>
+      <w:r>
+        <w:rPr>
+          <w:lang w:val="es-ES"/>
+        </w:rPr>
+        <w:t xml:space="preserve"> de </w:t>
+      </w:r>
+      <w:proofErr w:type="spellStart"/>
+      <w:r>
+        <w:rPr>
+          <w:lang w:val="es-ES"/>
+        </w:rPr>
+        <w:t>configurac</w:t>
+      </w:r>
+      <w:r>
+        <w:rPr>
+          <w:lang w:val="es-CR"/>
+        </w:rPr>
+        <w:t>ión</w:t>
+      </w:r>
+      <w:proofErr w:type="spellEnd"/>
+      <w:r>
+        <w:rPr>
+          <w:lang w:val="es-CR"/>
+        </w:rPr>
+        <w:t xml:space="preserve"> en la raíz del proyecto</w:t>
+      </w:r>
+      <w:r>
+        <w:rPr>
+          <w:lang w:val="es-CR"/>
+        </w:rPr>
+        <w:t xml:space="preserve">, el </w:t>
+      </w:r>
+      <w:proofErr w:type="spellStart"/>
+      <w:r>
+        <w:rPr>
+          <w:i/>
+          <w:lang w:val="es-CR"/>
+        </w:rPr>
+        <w:t>Policyfile.rb</w:t>
+      </w:r>
+      <w:proofErr w:type="spellEnd"/>
+      <w:r>
+        <w:rPr>
+          <w:lang w:val="es-CR"/>
+        </w:rPr>
+        <w:t xml:space="preserve"> y el </w:t>
+      </w:r>
+      <w:proofErr w:type="spellStart"/>
+      <w:r>
+        <w:rPr>
+          <w:i/>
+          <w:lang w:val="es-CR"/>
+        </w:rPr>
+        <w:t>kitchen.yml</w:t>
+      </w:r>
+      <w:proofErr w:type="spellEnd"/>
+      <w:r>
+        <w:rPr>
+          <w:lang w:val="es-CR"/>
+        </w:rPr>
+        <w:t>:</w:t>
+      </w:r>
+    </w:p>
+    <w:p>
+      <w:pPr>
+        <w:pStyle w:val="Prrafodelista"/>
+        <w:numPr>
+          <w:ilvl w:val="0"/>
+          <w:numId w:val="8"/>
+        </w:numPr>
+        <w:rPr>
+          <w:lang w:val="es-CR"/>
+        </w:rPr>
+      </w:pPr>
+      <w:r>
+        <w:rPr>
+          <w:lang w:val="es-CR"/>
+        </w:rPr>
+        <w:t xml:space="preserve">El </w:t>
+      </w:r>
+      <w:proofErr w:type="spellStart"/>
+      <w:r>
+        <w:rPr>
+          <w:i/>
+          <w:lang w:val="es-CR"/>
+        </w:rPr>
+        <w:t>Policyfile.rb</w:t>
+      </w:r>
+      <w:proofErr w:type="spellEnd"/>
+      <w:r>
+        <w:rPr>
+          <w:lang w:val="es-CR"/>
+        </w:rPr>
+        <w:t xml:space="preserve"> contiene</w:t>
+      </w:r>
+      <w:r>
+        <w:rPr>
+          <w:lang w:val="es-CR"/>
+        </w:rPr>
+        <w:t xml:space="preserve"> </w:t>
+      </w:r>
+      <w:r>
+        <w:rPr>
+          <w:lang w:val="es-CR"/>
+        </w:rPr>
+        <w:t>la</w:t>
+      </w:r>
+      <w:r>
+        <w:rPr>
+          <w:lang w:val="es-CR"/>
+        </w:rPr>
+        <w:t>s dependencias</w:t>
+      </w:r>
+      <w:r>
+        <w:rPr>
+          <w:lang w:val="es-CR"/>
+        </w:rPr>
+        <w:t xml:space="preserve"> y variables</w:t>
+      </w:r>
+      <w:r>
+        <w:rPr>
+          <w:lang w:val="es-CR"/>
+        </w:rPr>
+        <w:t xml:space="preserve"> para hacer un despliegue</w:t>
+      </w:r>
+      <w:r>
+        <w:rPr>
+          <w:lang w:val="es-CR"/>
+        </w:rPr>
+        <w:t xml:space="preserve"> en un ambiente de producción</w:t>
+      </w:r>
+      <w:r>
+        <w:rPr>
+          <w:lang w:val="es-CR"/>
+        </w:rPr>
+        <w:t>.</w:t>
+      </w:r>
+    </w:p>
+    <w:p>
+      <w:pPr>
+        <w:jc w:val="center"/>
+        <w:rPr>
+          <w:lang w:val="es-CR"/>
+        </w:rPr>
+      </w:pPr>
+      <w:r>
+        <w:rPr>
+          <w:lang w:val="es-CR"/>
+        </w:rPr>
+        <w:lastRenderedPageBreak/>
+        <w:drawing>
+          <wp:inline distT="0" distB="0" distL="0" distR="0" wp14:anchorId="35F2D219" wp14:editId="5836B405">
+            <wp:extent cx="4691482" cy="3223260"/>
+            <wp:effectExtent l="0" t="0" r="0" b="0"/>
+            <wp:docPr id="2142679185" name="Imagen 1"/>
+            <wp:cNvGraphicFramePr>
+              <a:graphicFrameLocks xmlns:a="http://schemas.openxmlformats.org/drawingml/2006/main" noChangeAspect="1"/>
+            </wp:cNvGraphicFramePr>
+            <a:graphic xmlns:a="http://schemas.openxmlformats.org/drawingml/2006/main">
+              <a:graphicData uri="http://schemas.openxmlformats.org/drawingml/2006/picture">
+                <pic:pic xmlns:pic="http://schemas.openxmlformats.org/drawingml/2006/picture">
+                  <pic:nvPicPr>
+                    <pic:cNvPr id="2142679185" name=""/>
+                    <pic:cNvPicPr/>
+                  </pic:nvPicPr>
+                  <pic:blipFill>
+                    <a:blip r:embed="rId8"/>
+                    <a:stretch>
+                      <a:fillRect/>
+                    </a:stretch>
+                  </pic:blipFill>
+                  <pic:spPr>
+                    <a:xfrm>
+                      <a:off x="0" y="0"/>
+                      <a:ext cx="4693983" cy="3224978"/>
+                    </a:xfrm>
+                    <a:prstGeom prst="rect">
+                      <a:avLst/>
+                    </a:prstGeom>
+                  </pic:spPr>
+                </pic:pic>
+              </a:graphicData>
+            </a:graphic>
+          </wp:inline>
+        </w:drawing>
+      </w:r>
+    </w:p>
+    <w:p>
+      <w:pPr>
+        <w:pStyle w:val="Prrafodelista"/>
+        <w:numPr>
+          <w:ilvl w:val="0"/>
+          <w:numId w:val="8"/>
+        </w:numPr>
+        <w:rPr>
+          <w:lang w:val="es-CR"/>
+        </w:rPr>
+      </w:pPr>
+      <w:r>
+        <w:rPr>
+          <w:lang w:val="es-CR"/>
+        </w:rPr>
+        <w:t xml:space="preserve">El </w:t>
+      </w:r>
+      <w:proofErr w:type="spellStart"/>
+      <w:r>
+        <w:rPr>
+          <w:i/>
+          <w:lang w:val="es-CR"/>
+        </w:rPr>
+        <w:t>kitchen.yml</w:t>
+      </w:r>
+      <w:proofErr w:type="spellEnd"/>
+      <w:r>
+        <w:rPr>
+          <w:lang w:val="es-CR"/>
+        </w:rPr>
+        <w:t xml:space="preserve"> </w:t>
+      </w:r>
+      <w:r>
+        <w:rPr>
+          <w:lang w:val="es-CR"/>
+        </w:rPr>
+        <w:t xml:space="preserve">configura </w:t>
+      </w:r>
+      <w:r>
+        <w:rPr>
+          <w:lang w:val="es-CR"/>
+        </w:rPr>
+        <w:t xml:space="preserve">las pruebas locales, </w:t>
+      </w:r>
+      <w:r>
+        <w:rPr>
+          <w:lang w:val="es-CR"/>
+        </w:rPr>
+        <w:t>indica</w:t>
+      </w:r>
+      <w:r>
+        <w:rPr>
+          <w:lang w:val="es-CR"/>
+        </w:rPr>
+        <w:t xml:space="preserve"> las plataformas en las que se van a hacer pruebas y define </w:t>
+      </w:r>
+      <w:r>
+        <w:rPr>
+          <w:lang w:val="es-CR"/>
+        </w:rPr>
+        <w:t>las suites de pruebas.</w:t>
+      </w:r>
+    </w:p>
+    <w:p>
+      <w:pPr>
+        <w:jc w:val="center"/>
+        <w:rPr>
+          <w:lang w:val="es-CR"/>
+        </w:rPr>
+      </w:pPr>
+      <w:r>
+        <w:rPr>
+          <w:lang w:val="es-CR"/>
+        </w:rPr>
+        <w:drawing>
+          <wp:inline distT="0" distB="0" distL="0" distR="0" wp14:anchorId="32CEE672" wp14:editId="466B7516">
+            <wp:extent cx="2385267" cy="4252328"/>
+            <wp:effectExtent l="0" t="0" r="0" b="0"/>
+            <wp:docPr id="1939694443" name="Imagen 1"/>
+            <wp:cNvGraphicFramePr>
+              <a:graphicFrameLocks xmlns:a="http://schemas.openxmlformats.org/drawingml/2006/main" noChangeAspect="1"/>
+            </wp:cNvGraphicFramePr>
+            <a:graphic xmlns:a="http://schemas.openxmlformats.org/drawingml/2006/main">
+              <a:graphicData uri="http://schemas.openxmlformats.org/drawingml/2006/picture">
+                <pic:pic xmlns:pic="http://schemas.openxmlformats.org/drawingml/2006/picture">
+                  <pic:nvPicPr>
+                    <pic:cNvPr id="1939694443" name=""/>
+                    <pic:cNvPicPr/>
+                  </pic:nvPicPr>
+                  <pic:blipFill>
+                    <a:blip r:embed="rId9"/>
+                    <a:stretch>
+                      <a:fillRect/>
+                    </a:stretch>
+                  </pic:blipFill>
+                  <pic:spPr>
+                    <a:xfrm>
+                      <a:off x="0" y="0"/>
+                      <a:ext cx="2385267" cy="4252328"/>
+                    </a:xfrm>
+                    <a:prstGeom prst="rect">
+                      <a:avLst/>
+                    </a:prstGeom>
+                  </pic:spPr>
+                </pic:pic>
+              </a:graphicData>
+            </a:graphic>
+          </wp:inline>
+        </w:drawing>
+      </w:r>
+    </w:p>
+    <w:p>
+      <w:pPr>
+        <w:jc w:val="both"/>
+        <w:rPr>
+          <w:lang w:val="es-ES"/>
+        </w:rPr>
+      </w:pPr>
+      <w:r>
+        <w:rPr>
+          <w:lang w:val="es-ES"/>
+        </w:rPr>
+        <w:lastRenderedPageBreak/>
+        <w:t>Luego s</w:t>
+      </w:r>
+      <w:r>
+        <w:rPr>
+          <w:lang w:val="es-ES"/>
+        </w:rPr>
+        <w:t>e crea la jerarquía de carpetas para las pruebas</w:t>
+      </w:r>
+      <w:r>
+        <w:rPr>
+          <w:lang w:val="es-ES"/>
+        </w:rPr>
+        <w:t xml:space="preserve">, esta es </w:t>
+      </w:r>
+      <w:r>
+        <w:rPr>
+          <w:i/>
+          <w:iCs/>
+          <w:lang w:val="es-CR"/>
+        </w:rPr>
+        <w:t>test</w:t>
+      </w:r>
+      <w:r>
+        <w:rPr>
+          <w:i/>
+          <w:iCs/>
+          <w:lang w:val="es-CR"/>
+        </w:rPr>
+        <w:t>/</w:t>
+      </w:r>
+      <w:proofErr w:type="spellStart"/>
+      <w:r>
+        <w:rPr>
+          <w:i/>
+          <w:iCs/>
+          <w:lang w:val="es-CR"/>
+        </w:rPr>
+        <w:t>integration</w:t>
+      </w:r>
+      <w:proofErr w:type="spellEnd"/>
+      <w:r>
+        <w:rPr>
+          <w:i/>
+          <w:iCs/>
+          <w:lang w:val="es-CR"/>
+        </w:rPr>
+        <w:t>/</w:t>
+      </w:r>
+      <w:proofErr w:type="spellStart"/>
+      <w:r>
+        <w:rPr>
+          <w:i/>
+          <w:iCs/>
+          <w:lang w:val="es-CR"/>
+        </w:rPr>
+        <w:t>wordpress</w:t>
+      </w:r>
+      <w:proofErr w:type="spellEnd"/>
+      <w:r>
+        <w:rPr>
+          <w:lang w:val="es-CR"/>
+        </w:rPr>
+        <w:t>.</w:t>
+      </w:r>
+    </w:p>
+    <w:p>
+      <w:pPr>
+        <w:jc w:val="both"/>
+        <w:rPr>
+          <w:iCs/>
+          <w:lang w:val="es-CR"/>
+        </w:rPr>
+      </w:pPr>
+      <w:r>
+        <w:rPr>
+          <w:lang w:val="es-ES"/>
+        </w:rPr>
+        <w:t>Finalmente</w:t>
+      </w:r>
+      <w:r>
+        <w:rPr>
+          <w:lang w:val="es-ES"/>
+        </w:rPr>
+        <w:t xml:space="preserve"> </w:t>
+      </w:r>
+      <w:r>
+        <w:rPr>
+          <w:lang w:val="es-ES"/>
+        </w:rPr>
+        <w:t xml:space="preserve">se </w:t>
+      </w:r>
+      <w:r>
+        <w:rPr>
+          <w:lang w:val="es-ES"/>
+        </w:rPr>
+        <w:t>crea el</w:t>
+      </w:r>
+      <w:r>
+        <w:rPr>
+          <w:lang w:val="es-ES"/>
+        </w:rPr>
+        <w:t xml:space="preserve"> archivo con las pruebas de integración, </w:t>
+      </w:r>
+      <w:proofErr w:type="spellStart"/>
+      <w:r>
+        <w:rPr>
+          <w:i/>
+          <w:lang w:val="es-ES"/>
+        </w:rPr>
+        <w:t>wordpress_spec.rb</w:t>
+      </w:r>
+      <w:proofErr w:type="spellEnd"/>
+      <w:r>
+        <w:rPr>
+          <w:iCs/>
+          <w:lang w:val="es-ES"/>
+        </w:rPr>
+        <w:t xml:space="preserve">. Las pruebas realizadas </w:t>
+      </w:r>
+      <w:r>
+        <w:rPr>
+          <w:iCs/>
+          <w:lang w:val="es-ES"/>
+        </w:rPr>
+        <w:t xml:space="preserve">verifican </w:t>
+      </w:r>
+      <w:r>
+        <w:rPr>
+          <w:iCs/>
+          <w:lang w:val="es-ES"/>
+        </w:rPr>
+        <w:t>lo siguiente</w:t>
+      </w:r>
+      <w:r>
+        <w:rPr>
+          <w:iCs/>
+          <w:lang w:val="es-CR"/>
+        </w:rPr>
+        <w:t>:</w:t>
+      </w:r>
+    </w:p>
+    <w:p>
+      <w:pPr>
+        <w:pStyle w:val="Prrafodelista"/>
+        <w:numPr>
+          <w:ilvl w:val="0"/>
+          <w:numId w:val="4"/>
+        </w:numPr>
+        <w:jc w:val="both"/>
+        <w:rPr>
+          <w:iCs/>
+          <w:lang w:val="es-CR"/>
+        </w:rPr>
+      </w:pPr>
+      <w:r>
+        <w:rPr>
+          <w:iCs/>
+          <w:lang w:val="es-ES"/>
+        </w:rPr>
+        <w:t>Que el servicio</w:t>
+      </w:r>
+      <w:r>
+        <w:rPr>
+          <w:iCs/>
+          <w:lang w:val="es-ES"/>
+        </w:rPr>
+        <w:t xml:space="preserve"> de Apache esté en funcionamiento</w:t>
+      </w:r>
+      <w:r>
+        <w:rPr>
+          <w:iCs/>
+          <w:lang w:val="es-ES"/>
+        </w:rPr>
+        <w:t>.</w:t>
+      </w:r>
+    </w:p>
+    <w:p>
+      <w:pPr>
+        <w:pStyle w:val="Prrafodelista"/>
+        <w:numPr>
+          <w:ilvl w:val="0"/>
+          <w:numId w:val="4"/>
+        </w:numPr>
+        <w:jc w:val="both"/>
+        <w:rPr>
+          <w:iCs/>
+          <w:lang w:val="es-CR"/>
+        </w:rPr>
+      </w:pPr>
+      <w:r>
+        <w:rPr>
+          <w:iCs/>
+          <w:lang w:val="es-ES"/>
+        </w:rPr>
+        <w:t xml:space="preserve">Que </w:t>
+      </w:r>
+      <w:r>
+        <w:rPr>
+          <w:iCs/>
+          <w:lang w:val="es-ES"/>
+        </w:rPr>
+        <w:t xml:space="preserve">la configuración de </w:t>
+      </w:r>
+      <w:r>
+        <w:rPr>
+          <w:iCs/>
+          <w:lang w:val="es-ES"/>
+        </w:rPr>
+        <w:t xml:space="preserve">la página web de </w:t>
+      </w:r>
+      <w:r>
+        <w:rPr>
+          <w:iCs/>
+          <w:lang w:val="es-ES"/>
+        </w:rPr>
+        <w:t>Apache</w:t>
+      </w:r>
+      <w:r>
+        <w:rPr>
+          <w:iCs/>
+          <w:lang w:val="es-ES"/>
+        </w:rPr>
+        <w:t xml:space="preserve"> para </w:t>
+      </w:r>
+      <w:r>
+        <w:rPr>
+          <w:iCs/>
+          <w:lang w:val="es-ES"/>
+        </w:rPr>
+        <w:t>WordPress</w:t>
+      </w:r>
+      <w:r>
+        <w:rPr>
+          <w:iCs/>
+          <w:lang w:val="es-ES"/>
+        </w:rPr>
+        <w:t xml:space="preserve"> </w:t>
+      </w:r>
+      <w:r>
+        <w:rPr>
+          <w:iCs/>
+          <w:lang w:val="es-ES"/>
+        </w:rPr>
+        <w:t>exista</w:t>
+      </w:r>
+      <w:r>
+        <w:rPr>
+          <w:iCs/>
+          <w:lang w:val="es-ES"/>
+        </w:rPr>
+        <w:t>.</w:t>
+      </w:r>
+    </w:p>
+    <w:p>
+      <w:pPr>
+        <w:pStyle w:val="Prrafodelista"/>
+        <w:numPr>
+          <w:ilvl w:val="0"/>
+          <w:numId w:val="4"/>
+        </w:numPr>
+        <w:jc w:val="both"/>
+        <w:rPr>
+          <w:iCs/>
+          <w:lang w:val="es-CR"/>
+        </w:rPr>
+      </w:pPr>
+      <w:r>
+        <w:rPr>
+          <w:iCs/>
+          <w:lang w:val="es-ES"/>
+        </w:rPr>
+        <w:t>Que el servicio</w:t>
+      </w:r>
+      <w:r>
+        <w:rPr>
+          <w:iCs/>
+          <w:lang w:val="es-ES"/>
+        </w:rPr>
+        <w:t xml:space="preserve"> de </w:t>
+      </w:r>
+      <w:r>
+        <w:rPr>
+          <w:iCs/>
+          <w:lang w:val="es-ES"/>
+        </w:rPr>
+        <w:t>MySQL</w:t>
+      </w:r>
+      <w:r>
+        <w:rPr>
+          <w:iCs/>
+          <w:lang w:val="es-ES"/>
+        </w:rPr>
+        <w:t xml:space="preserve"> esté en funcionamiento</w:t>
+      </w:r>
+      <w:r>
+        <w:rPr>
+          <w:iCs/>
+          <w:lang w:val="es-ES"/>
+        </w:rPr>
+        <w:t>.</w:t>
+      </w:r>
+    </w:p>
+    <w:p>
+      <w:pPr>
+        <w:pStyle w:val="Prrafodelista"/>
+        <w:numPr>
+          <w:ilvl w:val="0"/>
+          <w:numId w:val="4"/>
+        </w:numPr>
+        <w:jc w:val="both"/>
+        <w:rPr>
+          <w:iCs/>
+          <w:lang w:val="es-CR"/>
+        </w:rPr>
+      </w:pPr>
+      <w:r>
+        <w:rPr>
+          <w:iCs/>
+          <w:lang w:val="es-CR"/>
+        </w:rPr>
+        <w:t>Que</w:t>
+      </w:r>
+      <w:r>
+        <w:rPr>
+          <w:iCs/>
+          <w:lang w:val="es-CR"/>
+        </w:rPr>
+        <w:t xml:space="preserve"> las credenciales, y la base de datos, de WordPress se hayan creado correctamente.</w:t>
+      </w:r>
+    </w:p>
+    <w:p>
+      <w:pPr>
+        <w:pStyle w:val="Prrafodelista"/>
+        <w:numPr>
+          <w:ilvl w:val="0"/>
+          <w:numId w:val="4"/>
+        </w:numPr>
+        <w:jc w:val="both"/>
+        <w:rPr>
+          <w:iCs/>
+          <w:lang w:val="es-CR"/>
+        </w:rPr>
+      </w:pPr>
+      <w:r>
+        <w:rPr>
+          <w:iCs/>
+          <w:lang w:val="es-CR"/>
+        </w:rPr>
+        <w:t xml:space="preserve">Que la página </w:t>
+      </w:r>
+      <w:r>
+        <w:rPr>
+          <w:iCs/>
+          <w:lang w:val="es-CR"/>
+        </w:rPr>
+        <w:t>creada con WordPress este disponible y respondiendo solicitudes.</w:t>
+      </w:r>
+    </w:p>
+    <w:p>
+      <w:pPr>
+        <w:jc w:val="center"/>
+        <w:rPr>
+          <w:lang w:val="es-CR"/>
+        </w:rPr>
+      </w:pPr>
+      <w:r>
+        <w:rPr>
+          <w:lang w:val="es-CR"/>
+        </w:rPr>
+        <w:drawing>
+          <wp:inline distT="0" distB="0" distL="0" distR="0" wp14:anchorId="4F47559F" wp14:editId="2E0A0139">
+            <wp:extent cx="5516880" cy="3778120"/>
+            <wp:effectExtent l="0" t="0" r="7620" b="0"/>
+            <wp:docPr id="774746490" name="Imagen 1"/>
+            <wp:cNvGraphicFramePr>
+              <a:graphicFrameLocks xmlns:a="http://schemas.openxmlformats.org/drawingml/2006/main" noChangeAspect="1"/>
+            </wp:cNvGraphicFramePr>
+            <a:graphic xmlns:a="http://schemas.openxmlformats.org/drawingml/2006/main">
+              <a:graphicData uri="http://schemas.openxmlformats.org/drawingml/2006/picture">
+                <pic:pic xmlns:pic="http://schemas.openxmlformats.org/drawingml/2006/picture">
+                  <pic:nvPicPr>
+                    <pic:cNvPr id="774746490" name=""/>
+                    <pic:cNvPicPr/>
+                  </pic:nvPicPr>
+                  <pic:blipFill>
+                    <a:blip r:embed="rId10"/>
+                    <a:stretch>
+                      <a:fillRect/>
+                    </a:stretch>
+                  </pic:blipFill>
+                  <pic:spPr>
+                    <a:xfrm>
+                      <a:off x="0" y="0"/>
+                      <a:ext cx="5520331" cy="3780483"/>
+                    </a:xfrm>
+                    <a:prstGeom prst="rect">
+                      <a:avLst/>
+                    </a:prstGeom>
+                  </pic:spPr>
+                </pic:pic>
+              </a:graphicData>
+            </a:graphic>
+          </wp:inline>
+        </w:drawing>
+      </w:r>
+    </w:p>
+    <w:p>
+      <w:pPr>
+        <w:rPr>
+          <w:iCs/>
+          <w:lang w:val="es-CR"/>
+        </w:rPr>
+      </w:pPr>
+      <w:r>
+        <w:rPr>
+          <w:lang w:val="es-CR"/>
+        </w:rPr>
+        <w:t>Una vez tod</w:t>
+      </w:r>
+      <w:r>
+        <w:rPr>
+          <w:lang w:val="es-CR"/>
+        </w:rPr>
+        <w:t xml:space="preserve">a la configuración es completada se pueden ejecutar las pruebas ejecutando el comando </w:t>
+      </w:r>
+      <w:proofErr w:type="spellStart"/>
+      <w:r>
+        <w:rPr>
+          <w:i/>
+          <w:lang w:val="es-CR"/>
+        </w:rPr>
+        <w:t>kitchen</w:t>
+      </w:r>
+      <w:proofErr w:type="spellEnd"/>
+      <w:r>
+        <w:rPr>
+          <w:i/>
+          <w:lang w:val="es-CR"/>
+        </w:rPr>
+        <w:t xml:space="preserve"> test</w:t>
+      </w:r>
+      <w:r>
+        <w:rPr>
+          <w:iCs/>
+          <w:lang w:val="es-CR"/>
+        </w:rPr>
+        <w:t>.</w:t>
+      </w:r>
+    </w:p>
+    <w:p>
+      <w:pPr>
+        <w:jc w:val="center"/>
+        <w:rPr>
+          <w:lang w:val="es-CR"/>
+        </w:rPr>
+      </w:pPr>
+      <w:r>
+        <w:rPr>
+          <w:lang w:val="es-CR"/>
+        </w:rPr>
+        <w:lastRenderedPageBreak/>
+        <w:drawing>
+          <wp:inline distT="0" distB="0" distL="0" distR="0" wp14:anchorId="79170CDE" wp14:editId="04559D42">
+            <wp:extent cx="4138019" cy="4046571"/>
+            <wp:effectExtent l="0" t="0" r="0" b="0"/>
+            <wp:docPr id="1780159967" name="Imagen 1"/>
+            <wp:cNvGraphicFramePr>
+              <a:graphicFrameLocks xmlns:a="http://schemas.openxmlformats.org/drawingml/2006/main" noChangeAspect="1"/>
+            </wp:cNvGraphicFramePr>
+            <a:graphic xmlns:a="http://schemas.openxmlformats.org/drawingml/2006/main">
+              <a:graphicData uri="http://schemas.openxmlformats.org/drawingml/2006/picture">
+                <pic:pic xmlns:pic="http://schemas.openxmlformats.org/drawingml/2006/picture">
+                  <pic:nvPicPr>
+                    <pic:cNvPr id="1780159967" name=""/>
+                    <pic:cNvPicPr/>
+                  </pic:nvPicPr>
+                  <pic:blipFill>
+                    <a:blip r:embed="rId11"/>
+                    <a:stretch>
+                      <a:fillRect/>
+                    </a:stretch>
+                  </pic:blipFill>
+                  <pic:spPr>
+                    <a:xfrm>
+                      <a:off x="0" y="0"/>
+                      <a:ext cx="4138019" cy="4046571"/>
+                    </a:xfrm>
+                    <a:prstGeom prst="rect">
+                      <a:avLst/>
+                    </a:prstGeom>
+                  </pic:spPr>
+                </pic:pic>
+              </a:graphicData>
+            </a:graphic>
+          </wp:inline>
+        </w:drawing>
+      </w:r>
     </w:p>
     <w:sectPr>
       <w:pgSz w:w="12240" w:h="15840"/>
@@ -1667,6 +2810,27 @@
 <file path=word/numbering.xml><?xml version="1.0" encoding="utf-8"?>
 <w:numbering xmlns:wpc="http://schemas.microsoft.com/office/word/2010/wordprocessingCanvas" xmlns:cx="http://schemas.microsoft.com/office/drawing/2014/chartex" xmlns:cx1="http://schemas.microsoft.com/office/drawing/2015/9/8/chartex" xmlns:cx2="http://schemas.microsoft.com/office/drawing/2015/10/21/chartex" xmlns:cx3="http://schemas.microsoft.com/office/drawing/2016/5/9/chartex" xmlns:cx4="http://schemas.microsoft.com/office/drawing/2016/5/10/chartex" xmlns:cx5="http://schemas.microsoft.com/office/drawing/2016/5/11/chartex" xmlns:cx6="http://schemas.microsoft.com/office/drawing/2016/5/12/chartex" xmlns:cx7="http://schemas.microsoft.com/office/drawing/2016/5/13/chartex" xmlns:cx8="http://schemas.microsoft.com/office/drawing/2016/5/14/chartex" xmlns:mc="http://schemas.openxmlformats.org/markup-compatibility/2006" xmlns:aink="http://schemas.microsoft.com/office/drawing/2016/ink" xmlns:am3d="http://schemas.microsoft.com/office/drawing/2017/model3d" xmlns:o="urn:schemas-microsoft-com:office:office" xmlns:oel="http://schemas.microsoft.com/office/2019/extlst" xmlns:r="http://schemas.openxmlformats.org/officeDocument/2006/relationships" xmlns:m="http://schemas.openxmlformats.org/officeDocument/2006/math" xmlns:v="urn:schemas-microsoft-com:vml" xmlns:wp14="http://schemas.microsoft.com/office/word/2010/wordprocessingDrawing" xmlns:wp="http://schemas.openxmlformats.org/drawingml/2006/wordprocessingDrawing" xmlns:w10="urn:schemas-microsoft-com:office:word" xmlns:w="http://schemas.openxmlformats.org/wordprocessingml/2006/main" xmlns:w14="http://schemas.microsoft.com/office/word/2010/wordml" xmlns:w15="http://schemas.microsoft.com/office/word/2012/wordml" xmlns:w16cex="http://schemas.microsoft.com/office/word/2018/wordml/cex" xmlns:w16cid="http://schemas.microsoft.com/office/word/2016/wordml/cid" xmlns:w16="http://schemas.microsoft.com/office/word/2018/wordml" xmlns:w16du="http://schemas.microsoft.com/office/word/2023/wordml/word16du" xmlns:w16sdtdh="http://schemas.microsoft.com/office/word/2020/wordml/sdtdatahash" xmlns:w16sdtfl="http://schemas.microsoft.com/office/word/2024/wordml/sdtformatlock" xmlns:w16se="http://schemas.microsoft.com/office/word/2015/wordml/symex" xmlns:wpg="http://schemas.microsoft.com/office/word/2010/wordprocessingGroup" xmlns:wpi="http://schemas.microsoft.com/office/word/2010/wordprocessingInk" xmlns:wne="http://schemas.microsoft.com/office/word/2006/wordml" xmlns:wps="http://schemas.microsoft.com/office/word/2010/wordprocessingShape" mc:Ignorable="w14 w15 w16se w16cid w16 w16cex w16sdtdh w16sdtfl w16du wp14">
   <w:abstractNum w:abstractNumId="0" w15:restartNumberingAfterBreak="0">
+    <w:nsid w:val="FFFFFF89"/>
+    <w:multiLevelType w:val="singleLevel"/>
+    <w:tmpl w:val="2D185F08"/>
+    <w:lvl w:ilvl="0">
+      <w:start w:val="1"/>
+      <w:numFmt w:val="bullet"/>
+      <w:pStyle w:val="Listaconvietas"/>
+      <w:lvlText w:val=""/>
+      <w:lvlJc w:val="left"/>
+      <w:pPr>
+        <w:tabs>
+          <w:tab w:val="num" w:pos="360"/>
+        </w:tabs>
+        <w:ind w:left="360" w:hanging="360"/>
+      </w:pPr>
+      <w:rPr>
+        <w:rFonts w:ascii="Symbol" w:hAnsi="Symbol" w:hint="default"/>
+      </w:rPr>
+    </w:lvl>
+  </w:abstractNum>
+  <w:abstractNum w:abstractNumId="1" w15:restartNumberingAfterBreak="0">
     <w:nsid w:val="07AE594E"/>
     <w:multiLevelType w:val="hybridMultilevel"/>
     <w:tmpl w:val="E5DCC6E4"/>
@@ -1755,7 +2919,120 @@
       </w:pPr>
     </w:lvl>
   </w:abstractNum>
-  <w:abstractNum w:abstractNumId="1" w15:restartNumberingAfterBreak="0">
+  <w:abstractNum w:abstractNumId="2" w15:restartNumberingAfterBreak="0">
+    <w:nsid w:val="0DC276CE"/>
+    <w:multiLevelType w:val="hybridMultilevel"/>
+    <w:tmpl w:val="ECFC0A34"/>
+    <w:lvl w:ilvl="0" w:tplc="140A0001">
+      <w:start w:val="1"/>
+      <w:numFmt w:val="bullet"/>
+      <w:lvlText w:val=""/>
+      <w:lvlJc w:val="left"/>
+      <w:pPr>
+        <w:ind w:left="768" w:hanging="360"/>
+      </w:pPr>
+      <w:rPr>
+        <w:rFonts w:ascii="Symbol" w:hAnsi="Symbol" w:hint="default"/>
+      </w:rPr>
+    </w:lvl>
+    <w:lvl w:ilvl="1" w:tplc="140A0003" w:tentative="1">
+      <w:start w:val="1"/>
+      <w:numFmt w:val="bullet"/>
+      <w:lvlText w:val="o"/>
+      <w:lvlJc w:val="left"/>
+      <w:pPr>
+        <w:ind w:left="1488" w:hanging="360"/>
+      </w:pPr>
+      <w:rPr>
+        <w:rFonts w:ascii="Courier New" w:hAnsi="Courier New" w:cs="Courier New" w:hint="default"/>
+      </w:rPr>
+    </w:lvl>
+    <w:lvl w:ilvl="2" w:tplc="140A0005" w:tentative="1">
+      <w:start w:val="1"/>
+      <w:numFmt w:val="bullet"/>
+      <w:lvlText w:val=""/>
+      <w:lvlJc w:val="left"/>
+      <w:pPr>
+        <w:ind w:left="2208" w:hanging="360"/>
+      </w:pPr>
+      <w:rPr>
+        <w:rFonts w:ascii="Wingdings" w:hAnsi="Wingdings" w:hint="default"/>
+      </w:rPr>
+    </w:lvl>
+    <w:lvl w:ilvl="3" w:tplc="140A0001" w:tentative="1">
+      <w:start w:val="1"/>
+      <w:numFmt w:val="bullet"/>
+      <w:lvlText w:val=""/>
+      <w:lvlJc w:val="left"/>
+      <w:pPr>
+        <w:ind w:left="2928" w:hanging="360"/>
+      </w:pPr>
+      <w:rPr>
+        <w:rFonts w:ascii="Symbol" w:hAnsi="Symbol" w:hint="default"/>
+      </w:rPr>
+    </w:lvl>
+    <w:lvl w:ilvl="4" w:tplc="140A0003" w:tentative="1">
+      <w:start w:val="1"/>
+      <w:numFmt w:val="bullet"/>
+      <w:lvlText w:val="o"/>
+      <w:lvlJc w:val="left"/>
+      <w:pPr>
+        <w:ind w:left="3648" w:hanging="360"/>
+      </w:pPr>
+      <w:rPr>
+        <w:rFonts w:ascii="Courier New" w:hAnsi="Courier New" w:cs="Courier New" w:hint="default"/>
+      </w:rPr>
+    </w:lvl>
+    <w:lvl w:ilvl="5" w:tplc="140A0005" w:tentative="1">
+      <w:start w:val="1"/>
+      <w:numFmt w:val="bullet"/>
+      <w:lvlText w:val=""/>
+      <w:lvlJc w:val="left"/>
+      <w:pPr>
+        <w:ind w:left="4368" w:hanging="360"/>
+      </w:pPr>
+      <w:rPr>
+        <w:rFonts w:ascii="Wingdings" w:hAnsi="Wingdings" w:hint="default"/>
+      </w:rPr>
+    </w:lvl>
+    <w:lvl w:ilvl="6" w:tplc="140A0001" w:tentative="1">
+      <w:start w:val="1"/>
+      <w:numFmt w:val="bullet"/>
+      <w:lvlText w:val=""/>
+      <w:lvlJc w:val="left"/>
+      <w:pPr>
+        <w:ind w:left="5088" w:hanging="360"/>
+      </w:pPr>
+      <w:rPr>
+        <w:rFonts w:ascii="Symbol" w:hAnsi="Symbol" w:hint="default"/>
+      </w:rPr>
+    </w:lvl>
+    <w:lvl w:ilvl="7" w:tplc="140A0003" w:tentative="1">
+      <w:start w:val="1"/>
+      <w:numFmt w:val="bullet"/>
+      <w:lvlText w:val="o"/>
+      <w:lvlJc w:val="left"/>
+      <w:pPr>
+        <w:ind w:left="5808" w:hanging="360"/>
+      </w:pPr>
+      <w:rPr>
+        <w:rFonts w:ascii="Courier New" w:hAnsi="Courier New" w:cs="Courier New" w:hint="default"/>
+      </w:rPr>
+    </w:lvl>
+    <w:lvl w:ilvl="8" w:tplc="140A0005" w:tentative="1">
+      <w:start w:val="1"/>
+      <w:numFmt w:val="bullet"/>
+      <w:lvlText w:val=""/>
+      <w:lvlJc w:val="left"/>
+      <w:pPr>
+        <w:ind w:left="6528" w:hanging="360"/>
+      </w:pPr>
+      <w:rPr>
+        <w:rFonts w:ascii="Wingdings" w:hAnsi="Wingdings" w:hint="default"/>
+      </w:rPr>
+    </w:lvl>
+  </w:abstractNum>
+  <w:abstractNum w:abstractNumId="3" w15:restartNumberingAfterBreak="0">
     <w:nsid w:val="0FE45B8C"/>
     <w:multiLevelType w:val="hybridMultilevel"/>
     <w:tmpl w:val="78141DEA"/>
@@ -1844,7 +3121,318 @@
       </w:pPr>
     </w:lvl>
   </w:abstractNum>
-  <w:abstractNum w:abstractNumId="2" w15:restartNumberingAfterBreak="0">
+  <w:abstractNum w:abstractNumId="4" w15:restartNumberingAfterBreak="0">
+    <w:nsid w:val="21EF79A4"/>
+    <w:multiLevelType w:val="hybridMultilevel"/>
+    <w:tmpl w:val="C7CA3986"/>
+    <w:lvl w:ilvl="0" w:tplc="140A000F">
+      <w:start w:val="1"/>
+      <w:numFmt w:val="decimal"/>
+      <w:lvlText w:val="%1."/>
+      <w:lvlJc w:val="left"/>
+      <w:pPr>
+        <w:ind w:left="1080" w:hanging="360"/>
+      </w:pPr>
+    </w:lvl>
+    <w:lvl w:ilvl="1" w:tplc="140A0019" w:tentative="1">
+      <w:start w:val="1"/>
+      <w:numFmt w:val="lowerLetter"/>
+      <w:lvlText w:val="%2."/>
+      <w:lvlJc w:val="left"/>
+      <w:pPr>
+        <w:ind w:left="1800" w:hanging="360"/>
+      </w:pPr>
+    </w:lvl>
+    <w:lvl w:ilvl="2" w:tplc="140A001B" w:tentative="1">
+      <w:start w:val="1"/>
+      <w:numFmt w:val="lowerRoman"/>
+      <w:lvlText w:val="%3."/>
+      <w:lvlJc w:val="right"/>
+      <w:pPr>
+        <w:ind w:left="2520" w:hanging="180"/>
+      </w:pPr>
+    </w:lvl>
+    <w:lvl w:ilvl="3" w:tplc="140A000F" w:tentative="1">
+      <w:start w:val="1"/>
+      <w:numFmt w:val="decimal"/>
+      <w:lvlText w:val="%4."/>
+      <w:lvlJc w:val="left"/>
+      <w:pPr>
+        <w:ind w:left="3240" w:hanging="360"/>
+      </w:pPr>
+    </w:lvl>
+    <w:lvl w:ilvl="4" w:tplc="140A0019" w:tentative="1">
+      <w:start w:val="1"/>
+      <w:numFmt w:val="lowerLetter"/>
+      <w:lvlText w:val="%5."/>
+      <w:lvlJc w:val="left"/>
+      <w:pPr>
+        <w:ind w:left="3960" w:hanging="360"/>
+      </w:pPr>
+    </w:lvl>
+    <w:lvl w:ilvl="5" w:tplc="140A001B" w:tentative="1">
+      <w:start w:val="1"/>
+      <w:numFmt w:val="lowerRoman"/>
+      <w:lvlText w:val="%6."/>
+      <w:lvlJc w:val="right"/>
+      <w:pPr>
+        <w:ind w:left="4680" w:hanging="180"/>
+      </w:pPr>
+    </w:lvl>
+    <w:lvl w:ilvl="6" w:tplc="140A000F" w:tentative="1">
+      <w:start w:val="1"/>
+      <w:numFmt w:val="decimal"/>
+      <w:lvlText w:val="%7."/>
+      <w:lvlJc w:val="left"/>
+      <w:pPr>
+        <w:ind w:left="5400" w:hanging="360"/>
+      </w:pPr>
+    </w:lvl>
+    <w:lvl w:ilvl="7" w:tplc="140A0019" w:tentative="1">
+      <w:start w:val="1"/>
+      <w:numFmt w:val="lowerLetter"/>
+      <w:lvlText w:val="%8."/>
+      <w:lvlJc w:val="left"/>
+      <w:pPr>
+        <w:ind w:left="6120" w:hanging="360"/>
+      </w:pPr>
+    </w:lvl>
+    <w:lvl w:ilvl="8" w:tplc="140A001B" w:tentative="1">
+      <w:start w:val="1"/>
+      <w:numFmt w:val="lowerRoman"/>
+      <w:lvlText w:val="%9."/>
+      <w:lvlJc w:val="right"/>
+      <w:pPr>
+        <w:ind w:left="6840" w:hanging="180"/>
+      </w:pPr>
+    </w:lvl>
+  </w:abstractNum>
+  <w:abstractNum w:abstractNumId="5" w15:restartNumberingAfterBreak="0">
+    <w:nsid w:val="24E05568"/>
+    <w:multiLevelType w:val="hybridMultilevel"/>
+    <w:tmpl w:val="5762A754"/>
+    <w:lvl w:ilvl="0" w:tplc="954C0780">
+      <w:numFmt w:val="bullet"/>
+      <w:lvlText w:val="-"/>
+      <w:lvlJc w:val="left"/>
+      <w:pPr>
+        <w:ind w:left="1080" w:hanging="360"/>
+      </w:pPr>
+      <w:rPr>
+        <w:rFonts w:ascii="Aptos" w:eastAsiaTheme="minorHAnsi" w:hAnsi="Aptos" w:cstheme="minorBidi" w:hint="default"/>
+      </w:rPr>
+    </w:lvl>
+    <w:lvl w:ilvl="1" w:tplc="140A0003" w:tentative="1">
+      <w:start w:val="1"/>
+      <w:numFmt w:val="bullet"/>
+      <w:lvlText w:val="o"/>
+      <w:lvlJc w:val="left"/>
+      <w:pPr>
+        <w:ind w:left="1800" w:hanging="360"/>
+      </w:pPr>
+      <w:rPr>
+        <w:rFonts w:ascii="Courier New" w:hAnsi="Courier New" w:cs="Courier New" w:hint="default"/>
+      </w:rPr>
+    </w:lvl>
+    <w:lvl w:ilvl="2" w:tplc="140A0005" w:tentative="1">
+      <w:start w:val="1"/>
+      <w:numFmt w:val="bullet"/>
+      <w:lvlText w:val=""/>
+      <w:lvlJc w:val="left"/>
+      <w:pPr>
+        <w:ind w:left="2520" w:hanging="360"/>
+      </w:pPr>
+      <w:rPr>
+        <w:rFonts w:ascii="Wingdings" w:hAnsi="Wingdings" w:hint="default"/>
+      </w:rPr>
+    </w:lvl>
+    <w:lvl w:ilvl="3" w:tplc="140A0001" w:tentative="1">
+      <w:start w:val="1"/>
+      <w:numFmt w:val="bullet"/>
+      <w:lvlText w:val=""/>
+      <w:lvlJc w:val="left"/>
+      <w:pPr>
+        <w:ind w:left="3240" w:hanging="360"/>
+      </w:pPr>
+      <w:rPr>
+        <w:rFonts w:ascii="Symbol" w:hAnsi="Symbol" w:hint="default"/>
+      </w:rPr>
+    </w:lvl>
+    <w:lvl w:ilvl="4" w:tplc="140A0003" w:tentative="1">
+      <w:start w:val="1"/>
+      <w:numFmt w:val="bullet"/>
+      <w:lvlText w:val="o"/>
+      <w:lvlJc w:val="left"/>
+      <w:pPr>
+        <w:ind w:left="3960" w:hanging="360"/>
+      </w:pPr>
+      <w:rPr>
+        <w:rFonts w:ascii="Courier New" w:hAnsi="Courier New" w:cs="Courier New" w:hint="default"/>
+      </w:rPr>
+    </w:lvl>
+    <w:lvl w:ilvl="5" w:tplc="140A0005" w:tentative="1">
+      <w:start w:val="1"/>
+      <w:numFmt w:val="bullet"/>
+      <w:lvlText w:val=""/>
+      <w:lvlJc w:val="left"/>
+      <w:pPr>
+        <w:ind w:left="4680" w:hanging="360"/>
+      </w:pPr>
+      <w:rPr>
+        <w:rFonts w:ascii="Wingdings" w:hAnsi="Wingdings" w:hint="default"/>
+      </w:rPr>
+    </w:lvl>
+    <w:lvl w:ilvl="6" w:tplc="140A0001" w:tentative="1">
+      <w:start w:val="1"/>
+      <w:numFmt w:val="bullet"/>
+      <w:lvlText w:val=""/>
+      <w:lvlJc w:val="left"/>
+      <w:pPr>
+        <w:ind w:left="5400" w:hanging="360"/>
+      </w:pPr>
+      <w:rPr>
+        <w:rFonts w:ascii="Symbol" w:hAnsi="Symbol" w:hint="default"/>
+      </w:rPr>
+    </w:lvl>
+    <w:lvl w:ilvl="7" w:tplc="140A0003" w:tentative="1">
+      <w:start w:val="1"/>
+      <w:numFmt w:val="bullet"/>
+      <w:lvlText w:val="o"/>
+      <w:lvlJc w:val="left"/>
+      <w:pPr>
+        <w:ind w:left="6120" w:hanging="360"/>
+      </w:pPr>
+      <w:rPr>
+        <w:rFonts w:ascii="Courier New" w:hAnsi="Courier New" w:cs="Courier New" w:hint="default"/>
+      </w:rPr>
+    </w:lvl>
+    <w:lvl w:ilvl="8" w:tplc="140A0005" w:tentative="1">
+      <w:start w:val="1"/>
+      <w:numFmt w:val="bullet"/>
+      <w:lvlText w:val=""/>
+      <w:lvlJc w:val="left"/>
+      <w:pPr>
+        <w:ind w:left="6840" w:hanging="360"/>
+      </w:pPr>
+      <w:rPr>
+        <w:rFonts w:ascii="Wingdings" w:hAnsi="Wingdings" w:hint="default"/>
+      </w:rPr>
+    </w:lvl>
+  </w:abstractNum>
+  <w:abstractNum w:abstractNumId="6" w15:restartNumberingAfterBreak="0">
+    <w:nsid w:val="3AC424B2"/>
+    <w:multiLevelType w:val="hybridMultilevel"/>
+    <w:tmpl w:val="BC8241BA"/>
+    <w:lvl w:ilvl="0" w:tplc="140A0001">
+      <w:start w:val="1"/>
+      <w:numFmt w:val="bullet"/>
+      <w:lvlText w:val=""/>
+      <w:lvlJc w:val="left"/>
+      <w:pPr>
+        <w:ind w:left="720" w:hanging="360"/>
+      </w:pPr>
+      <w:rPr>
+        <w:rFonts w:ascii="Symbol" w:hAnsi="Symbol" w:hint="default"/>
+      </w:rPr>
+    </w:lvl>
+    <w:lvl w:ilvl="1" w:tplc="140A0003" w:tentative="1">
+      <w:start w:val="1"/>
+      <w:numFmt w:val="bullet"/>
+      <w:lvlText w:val="o"/>
+      <w:lvlJc w:val="left"/>
+      <w:pPr>
+        <w:ind w:left="1440" w:hanging="360"/>
+      </w:pPr>
+      <w:rPr>
+        <w:rFonts w:ascii="Courier New" w:hAnsi="Courier New" w:cs="Courier New" w:hint="default"/>
+      </w:rPr>
+    </w:lvl>
+    <w:lvl w:ilvl="2" w:tplc="140A0005" w:tentative="1">
+      <w:start w:val="1"/>
+      <w:numFmt w:val="bullet"/>
+      <w:lvlText w:val=""/>
+      <w:lvlJc w:val="left"/>
+      <w:pPr>
+        <w:ind w:left="2160" w:hanging="360"/>
+      </w:pPr>
+      <w:rPr>
+        <w:rFonts w:ascii="Wingdings" w:hAnsi="Wingdings" w:hint="default"/>
+      </w:rPr>
+    </w:lvl>
+    <w:lvl w:ilvl="3" w:tplc="140A0001" w:tentative="1">
+      <w:start w:val="1"/>
+      <w:numFmt w:val="bullet"/>
+      <w:lvlText w:val=""/>
+      <w:lvlJc w:val="left"/>
+      <w:pPr>
+        <w:ind w:left="2880" w:hanging="360"/>
+      </w:pPr>
+      <w:rPr>
+        <w:rFonts w:ascii="Symbol" w:hAnsi="Symbol" w:hint="default"/>
+      </w:rPr>
+    </w:lvl>
+    <w:lvl w:ilvl="4" w:tplc="140A0003" w:tentative="1">
+      <w:start w:val="1"/>
+      <w:numFmt w:val="bullet"/>
+      <w:lvlText w:val="o"/>
+      <w:lvlJc w:val="left"/>
+      <w:pPr>
+        <w:ind w:left="3600" w:hanging="360"/>
+      </w:pPr>
+      <w:rPr>
+        <w:rFonts w:ascii="Courier New" w:hAnsi="Courier New" w:cs="Courier New" w:hint="default"/>
+      </w:rPr>
+    </w:lvl>
+    <w:lvl w:ilvl="5" w:tplc="140A0005" w:tentative="1">
+      <w:start w:val="1"/>
+      <w:numFmt w:val="bullet"/>
+      <w:lvlText w:val=""/>
+      <w:lvlJc w:val="left"/>
+      <w:pPr>
+        <w:ind w:left="4320" w:hanging="360"/>
+      </w:pPr>
+      <w:rPr>
+        <w:rFonts w:ascii="Wingdings" w:hAnsi="Wingdings" w:hint="default"/>
+      </w:rPr>
+    </w:lvl>
+    <w:lvl w:ilvl="6" w:tplc="140A0001" w:tentative="1">
+      <w:start w:val="1"/>
+      <w:numFmt w:val="bullet"/>
+      <w:lvlText w:val=""/>
+      <w:lvlJc w:val="left"/>
+      <w:pPr>
+        <w:ind w:left="5040" w:hanging="360"/>
+      </w:pPr>
+      <w:rPr>
+        <w:rFonts w:ascii="Symbol" w:hAnsi="Symbol" w:hint="default"/>
+      </w:rPr>
+    </w:lvl>
+    <w:lvl w:ilvl="7" w:tplc="140A0003" w:tentative="1">
+      <w:start w:val="1"/>
+      <w:numFmt w:val="bullet"/>
+      <w:lvlText w:val="o"/>
+      <w:lvlJc w:val="left"/>
+      <w:pPr>
+        <w:ind w:left="5760" w:hanging="360"/>
+      </w:pPr>
+      <w:rPr>
+        <w:rFonts w:ascii="Courier New" w:hAnsi="Courier New" w:cs="Courier New" w:hint="default"/>
+      </w:rPr>
+    </w:lvl>
+    <w:lvl w:ilvl="8" w:tplc="140A0005" w:tentative="1">
+      <w:start w:val="1"/>
+      <w:numFmt w:val="bullet"/>
+      <w:lvlText w:val=""/>
+      <w:lvlJc w:val="left"/>
+      <w:pPr>
+        <w:ind w:left="6480" w:hanging="360"/>
+      </w:pPr>
+      <w:rPr>
+        <w:rFonts w:ascii="Wingdings" w:hAnsi="Wingdings" w:hint="default"/>
+      </w:rPr>
+    </w:lvl>
+  </w:abstractNum>
+  <w:abstractNum w:abstractNumId="7" w15:restartNumberingAfterBreak="0">
     <w:nsid w:val="5953035A"/>
     <w:multiLevelType w:val="hybridMultilevel"/>
     <w:tmpl w:val="237C9B82"/>
@@ -1933,19 +3521,20 @@
       </w:pPr>
     </w:lvl>
   </w:abstractNum>
-  <w:abstractNum w:abstractNumId="3" w15:restartNumberingAfterBreak="0">
+  <w:abstractNum w:abstractNumId="8" w15:restartNumberingAfterBreak="0">
     <w:nsid w:val="72100F67"/>
     <w:multiLevelType w:val="hybridMultilevel"/>
-    <w:tmpl w:val="0E40F5CA"/>
-    <w:lvl w:ilvl="0" w:tplc="954C0780">
+    <w:tmpl w:val="0A827134"/>
+    <w:lvl w:ilvl="0" w:tplc="140A0001">
+      <w:start w:val="1"/>
       <w:numFmt w:val="bullet"/>
-      <w:lvlText w:val="-"/>
+      <w:lvlText w:val=""/>
       <w:lvlJc w:val="left"/>
       <w:pPr>
         <w:ind w:left="720" w:hanging="360"/>
       </w:pPr>
       <w:rPr>
-        <w:rFonts w:ascii="Aptos" w:eastAsiaTheme="minorHAnsi" w:hAnsi="Aptos" w:cstheme="minorBidi" w:hint="default"/>
+        <w:rFonts w:ascii="Symbol" w:hAnsi="Symbol" w:hint="default"/>
       </w:rPr>
     </w:lvl>
     <w:lvl w:ilvl="1" w:tplc="04090003" w:tentative="1">
@@ -2046,16 +3635,31 @@
     </w:lvl>
   </w:abstractNum>
   <w:num w:numId="1" w16cid:durableId="318922182">
+    <w:abstractNumId w:val="7"/>
+  </w:num>
+  <w:num w:numId="2" w16cid:durableId="1338461811">
+    <w:abstractNumId w:val="1"/>
+  </w:num>
+  <w:num w:numId="3" w16cid:durableId="1212351504">
+    <w:abstractNumId w:val="3"/>
+  </w:num>
+  <w:num w:numId="4" w16cid:durableId="353387883">
+    <w:abstractNumId w:val="8"/>
+  </w:num>
+  <w:num w:numId="5" w16cid:durableId="1828325629">
     <w:abstractNumId w:val="2"/>
   </w:num>
-  <w:num w:numId="2" w16cid:durableId="1338461811">
+  <w:num w:numId="6" w16cid:durableId="838227147">
+    <w:abstractNumId w:val="5"/>
+  </w:num>
+  <w:num w:numId="7" w16cid:durableId="194923458">
+    <w:abstractNumId w:val="4"/>
+  </w:num>
+  <w:num w:numId="8" w16cid:durableId="292247338">
+    <w:abstractNumId w:val="6"/>
+  </w:num>
+  <w:num w:numId="9" w16cid:durableId="1833795029">
     <w:abstractNumId w:val="0"/>
-  </w:num>
-  <w:num w:numId="3" w16cid:durableId="1212351504">
-    <w:abstractNumId w:val="1"/>
-  </w:num>
-  <w:num w:numId="4" w16cid:durableId="353387883">
-    <w:abstractNumId w:val="3"/>
   </w:num>
 </w:numbering>
 </file>
@@ -2462,11 +4066,11 @@
     <w:qFormat/>
     <w:rsid w:val="008C29E6"/>
   </w:style>
-  <w:style w:type="paragraph" w:styleId="Heading1">
+  <w:style w:type="paragraph" w:styleId="Ttulo1">
     <w:name w:val="heading 1"/>
     <w:basedOn w:val="Normal"/>
     <w:next w:val="Normal"/>
-    <w:link w:val="Heading1Char"/>
+    <w:link w:val="Ttulo1Car"/>
     <w:uiPriority w:val="9"/>
     <w:qFormat/>
     <w:rsid w:val="001576E7"/>
@@ -2483,11 +4087,11 @@
       <w:szCs w:val="40"/>
     </w:rPr>
   </w:style>
-  <w:style w:type="paragraph" w:styleId="Heading2">
+  <w:style w:type="paragraph" w:styleId="Ttulo2">
     <w:name w:val="heading 2"/>
     <w:basedOn w:val="Normal"/>
     <w:next w:val="Normal"/>
-    <w:link w:val="Heading2Char"/>
+    <w:link w:val="Ttulo2Car"/>
     <w:uiPriority w:val="9"/>
     <w:unhideWhenUsed/>
     <w:qFormat/>
@@ -2505,11 +4109,11 @@
       <w:szCs w:val="32"/>
     </w:rPr>
   </w:style>
-  <w:style w:type="paragraph" w:styleId="Heading3">
+  <w:style w:type="paragraph" w:styleId="Ttulo3">
     <w:name w:val="heading 3"/>
     <w:basedOn w:val="Normal"/>
     <w:next w:val="Normal"/>
-    <w:link w:val="Heading3Char"/>
+    <w:link w:val="Ttulo3Car"/>
     <w:uiPriority w:val="9"/>
     <w:unhideWhenUsed/>
     <w:qFormat/>
@@ -2527,11 +4131,11 @@
       <w:szCs w:val="28"/>
     </w:rPr>
   </w:style>
-  <w:style w:type="paragraph" w:styleId="Heading4">
+  <w:style w:type="paragraph" w:styleId="Ttulo4">
     <w:name w:val="heading 4"/>
     <w:basedOn w:val="Normal"/>
     <w:next w:val="Normal"/>
-    <w:link w:val="Heading4Char"/>
+    <w:link w:val="Ttulo4Car"/>
     <w:uiPriority w:val="9"/>
     <w:semiHidden/>
     <w:unhideWhenUsed/>
@@ -2550,11 +4154,11 @@
       <w:color w:val="0F4761" w:themeColor="accent1" w:themeShade="BF"/>
     </w:rPr>
   </w:style>
-  <w:style w:type="paragraph" w:styleId="Heading5">
+  <w:style w:type="paragraph" w:styleId="Ttulo5">
     <w:name w:val="heading 5"/>
     <w:basedOn w:val="Normal"/>
     <w:next w:val="Normal"/>
-    <w:link w:val="Heading5Char"/>
+    <w:link w:val="Ttulo5Car"/>
     <w:uiPriority w:val="9"/>
     <w:semiHidden/>
     <w:unhideWhenUsed/>
@@ -2571,11 +4175,11 @@
       <w:color w:val="0F4761" w:themeColor="accent1" w:themeShade="BF"/>
     </w:rPr>
   </w:style>
-  <w:style w:type="paragraph" w:styleId="Heading6">
+  <w:style w:type="paragraph" w:styleId="Ttulo6">
     <w:name w:val="heading 6"/>
     <w:basedOn w:val="Normal"/>
     <w:next w:val="Normal"/>
-    <w:link w:val="Heading6Char"/>
+    <w:link w:val="Ttulo6Car"/>
     <w:uiPriority w:val="9"/>
     <w:semiHidden/>
     <w:unhideWhenUsed/>
@@ -2594,11 +4198,11 @@
       <w:color w:val="595959" w:themeColor="text1" w:themeTint="A6"/>
     </w:rPr>
   </w:style>
-  <w:style w:type="paragraph" w:styleId="Heading7">
+  <w:style w:type="paragraph" w:styleId="Ttulo7">
     <w:name w:val="heading 7"/>
     <w:basedOn w:val="Normal"/>
     <w:next w:val="Normal"/>
-    <w:link w:val="Heading7Char"/>
+    <w:link w:val="Ttulo7Car"/>
     <w:uiPriority w:val="9"/>
     <w:semiHidden/>
     <w:unhideWhenUsed/>
@@ -2615,11 +4219,11 @@
       <w:color w:val="595959" w:themeColor="text1" w:themeTint="A6"/>
     </w:rPr>
   </w:style>
-  <w:style w:type="paragraph" w:styleId="Heading8">
+  <w:style w:type="paragraph" w:styleId="Ttulo8">
     <w:name w:val="heading 8"/>
     <w:basedOn w:val="Normal"/>
     <w:next w:val="Normal"/>
-    <w:link w:val="Heading8Char"/>
+    <w:link w:val="Ttulo8Car"/>
     <w:uiPriority w:val="9"/>
     <w:semiHidden/>
     <w:unhideWhenUsed/>
@@ -2638,11 +4242,11 @@
       <w:color w:val="272727" w:themeColor="text1" w:themeTint="D8"/>
     </w:rPr>
   </w:style>
-  <w:style w:type="paragraph" w:styleId="Heading9">
+  <w:style w:type="paragraph" w:styleId="Ttulo9">
     <w:name w:val="heading 9"/>
     <w:basedOn w:val="Normal"/>
     <w:next w:val="Normal"/>
-    <w:link w:val="Heading9Char"/>
+    <w:link w:val="Ttulo9Car"/>
     <w:uiPriority w:val="9"/>
     <w:semiHidden/>
     <w:unhideWhenUsed/>
@@ -2659,12 +4263,12 @@
       <w:color w:val="272727" w:themeColor="text1" w:themeTint="D8"/>
     </w:rPr>
   </w:style>
-  <w:style w:type="character" w:default="1" w:styleId="DefaultParagraphFont">
+  <w:style w:type="character" w:default="1" w:styleId="Fuentedeprrafopredeter">
     <w:name w:val="Default Paragraph Font"/>
     <w:uiPriority w:val="1"/>
     <w:unhideWhenUsed/>
   </w:style>
-  <w:style w:type="table" w:default="1" w:styleId="TableNormal">
+  <w:style w:type="table" w:default="1" w:styleId="Tablanormal">
     <w:name w:val="Normal Table"/>
     <w:uiPriority w:val="99"/>
     <w:semiHidden/>
@@ -2679,16 +4283,16 @@
       </w:tblCellMar>
     </w:tblPr>
   </w:style>
-  <w:style w:type="numbering" w:default="1" w:styleId="NoList">
+  <w:style w:type="numbering" w:default="1" w:styleId="Sinlista">
     <w:name w:val="No List"/>
     <w:uiPriority w:val="99"/>
     <w:semiHidden/>
     <w:unhideWhenUsed/>
   </w:style>
-  <w:style w:type="character" w:customStyle="1" w:styleId="Heading1Char">
-    <w:name w:val="Heading 1 Char"/>
-    <w:basedOn w:val="DefaultParagraphFont"/>
-    <w:link w:val="Heading1"/>
+  <w:style w:type="character" w:customStyle="1" w:styleId="Ttulo1Car">
+    <w:name w:val="Título 1 Car"/>
+    <w:basedOn w:val="Fuentedeprrafopredeter"/>
+    <w:link w:val="Ttulo1"/>
     <w:uiPriority w:val="9"/>
     <w:rsid w:val="001576E7"/>
     <w:rPr>
@@ -2698,10 +4302,10 @@
       <w:szCs w:val="40"/>
     </w:rPr>
   </w:style>
-  <w:style w:type="character" w:customStyle="1" w:styleId="Heading2Char">
-    <w:name w:val="Heading 2 Char"/>
-    <w:basedOn w:val="DefaultParagraphFont"/>
-    <w:link w:val="Heading2"/>
+  <w:style w:type="character" w:customStyle="1" w:styleId="Ttulo2Car">
+    <w:name w:val="Título 2 Car"/>
+    <w:basedOn w:val="Fuentedeprrafopredeter"/>
+    <w:link w:val="Ttulo2"/>
     <w:uiPriority w:val="9"/>
     <w:rsid w:val="001576E7"/>
     <w:rPr>
@@ -2711,10 +4315,10 @@
       <w:szCs w:val="32"/>
     </w:rPr>
   </w:style>
-  <w:style w:type="character" w:customStyle="1" w:styleId="Heading3Char">
-    <w:name w:val="Heading 3 Char"/>
-    <w:basedOn w:val="DefaultParagraphFont"/>
-    <w:link w:val="Heading3"/>
+  <w:style w:type="character" w:customStyle="1" w:styleId="Ttulo3Car">
+    <w:name w:val="Título 3 Car"/>
+    <w:basedOn w:val="Fuentedeprrafopredeter"/>
+    <w:link w:val="Ttulo3"/>
     <w:uiPriority w:val="9"/>
     <w:rsid w:val="001576E7"/>
     <w:rPr>
@@ -2724,10 +4328,10 @@
       <w:szCs w:val="28"/>
     </w:rPr>
   </w:style>
-  <w:style w:type="character" w:customStyle="1" w:styleId="Heading4Char">
-    <w:name w:val="Heading 4 Char"/>
-    <w:basedOn w:val="DefaultParagraphFont"/>
-    <w:link w:val="Heading4"/>
+  <w:style w:type="character" w:customStyle="1" w:styleId="Ttulo4Car">
+    <w:name w:val="Título 4 Car"/>
+    <w:basedOn w:val="Fuentedeprrafopredeter"/>
+    <w:link w:val="Ttulo4"/>
     <w:uiPriority w:val="9"/>
     <w:semiHidden/>
     <w:rsid w:val="001576E7"/>
@@ -2738,10 +4342,10 @@
       <w:color w:val="0F4761" w:themeColor="accent1" w:themeShade="BF"/>
     </w:rPr>
   </w:style>
-  <w:style w:type="character" w:customStyle="1" w:styleId="Heading5Char">
-    <w:name w:val="Heading 5 Char"/>
-    <w:basedOn w:val="DefaultParagraphFont"/>
-    <w:link w:val="Heading5"/>
+  <w:style w:type="character" w:customStyle="1" w:styleId="Ttulo5Car">
+    <w:name w:val="Título 5 Car"/>
+    <w:basedOn w:val="Fuentedeprrafopredeter"/>
+    <w:link w:val="Ttulo5"/>
     <w:uiPriority w:val="9"/>
     <w:semiHidden/>
     <w:rsid w:val="001576E7"/>
@@ -2750,10 +4354,10 @@
       <w:color w:val="0F4761" w:themeColor="accent1" w:themeShade="BF"/>
     </w:rPr>
   </w:style>
-  <w:style w:type="character" w:customStyle="1" w:styleId="Heading6Char">
-    <w:name w:val="Heading 6 Char"/>
-    <w:basedOn w:val="DefaultParagraphFont"/>
-    <w:link w:val="Heading6"/>
+  <w:style w:type="character" w:customStyle="1" w:styleId="Ttulo6Car">
+    <w:name w:val="Título 6 Car"/>
+    <w:basedOn w:val="Fuentedeprrafopredeter"/>
+    <w:link w:val="Ttulo6"/>
     <w:uiPriority w:val="9"/>
     <w:semiHidden/>
     <w:rsid w:val="001576E7"/>
@@ -2764,10 +4368,10 @@
       <w:color w:val="595959" w:themeColor="text1" w:themeTint="A6"/>
     </w:rPr>
   </w:style>
-  <w:style w:type="character" w:customStyle="1" w:styleId="Heading7Char">
-    <w:name w:val="Heading 7 Char"/>
-    <w:basedOn w:val="DefaultParagraphFont"/>
-    <w:link w:val="Heading7"/>
+  <w:style w:type="character" w:customStyle="1" w:styleId="Ttulo7Car">
+    <w:name w:val="Título 7 Car"/>
+    <w:basedOn w:val="Fuentedeprrafopredeter"/>
+    <w:link w:val="Ttulo7"/>
     <w:uiPriority w:val="9"/>
     <w:semiHidden/>
     <w:rsid w:val="001576E7"/>
@@ -2776,10 +4380,10 @@
       <w:color w:val="595959" w:themeColor="text1" w:themeTint="A6"/>
     </w:rPr>
   </w:style>
-  <w:style w:type="character" w:customStyle="1" w:styleId="Heading8Char">
-    <w:name w:val="Heading 8 Char"/>
-    <w:basedOn w:val="DefaultParagraphFont"/>
-    <w:link w:val="Heading8"/>
+  <w:style w:type="character" w:customStyle="1" w:styleId="Ttulo8Car">
+    <w:name w:val="Título 8 Car"/>
+    <w:basedOn w:val="Fuentedeprrafopredeter"/>
+    <w:link w:val="Ttulo8"/>
     <w:uiPriority w:val="9"/>
     <w:semiHidden/>
     <w:rsid w:val="001576E7"/>
@@ -2790,10 +4394,10 @@
       <w:color w:val="272727" w:themeColor="text1" w:themeTint="D8"/>
     </w:rPr>
   </w:style>
-  <w:style w:type="character" w:customStyle="1" w:styleId="Heading9Char">
-    <w:name w:val="Heading 9 Char"/>
-    <w:basedOn w:val="DefaultParagraphFont"/>
-    <w:link w:val="Heading9"/>
+  <w:style w:type="character" w:customStyle="1" w:styleId="Ttulo9Car">
+    <w:name w:val="Título 9 Car"/>
+    <w:basedOn w:val="Fuentedeprrafopredeter"/>
+    <w:link w:val="Ttulo9"/>
     <w:uiPriority w:val="9"/>
     <w:semiHidden/>
     <w:rsid w:val="001576E7"/>
@@ -2802,11 +4406,11 @@
       <w:color w:val="272727" w:themeColor="text1" w:themeTint="D8"/>
     </w:rPr>
   </w:style>
-  <w:style w:type="paragraph" w:styleId="Title">
+  <w:style w:type="paragraph" w:styleId="Ttulo">
     <w:name w:val="Title"/>
     <w:basedOn w:val="Normal"/>
     <w:next w:val="Normal"/>
-    <w:link w:val="TitleChar"/>
+    <w:link w:val="TtuloCar"/>
     <w:uiPriority w:val="10"/>
     <w:qFormat/>
     <w:rsid w:val="001576E7"/>
@@ -2822,10 +4426,10 @@
       <w:szCs w:val="56"/>
     </w:rPr>
   </w:style>
-  <w:style w:type="character" w:customStyle="1" w:styleId="TitleChar">
-    <w:name w:val="Title Char"/>
-    <w:basedOn w:val="DefaultParagraphFont"/>
-    <w:link w:val="Title"/>
+  <w:style w:type="character" w:customStyle="1" w:styleId="TtuloCar">
+    <w:name w:val="Título Car"/>
+    <w:basedOn w:val="Fuentedeprrafopredeter"/>
+    <w:link w:val="Ttulo"/>
     <w:uiPriority w:val="10"/>
     <w:rsid w:val="001576E7"/>
     <w:rPr>
@@ -2836,11 +4440,11 @@
       <w:szCs w:val="56"/>
     </w:rPr>
   </w:style>
-  <w:style w:type="paragraph" w:styleId="Subtitle">
+  <w:style w:type="paragraph" w:styleId="Subttulo">
     <w:name w:val="Subtitle"/>
     <w:basedOn w:val="Normal"/>
     <w:next w:val="Normal"/>
-    <w:link w:val="SubtitleChar"/>
+    <w:link w:val="SubttuloCar"/>
     <w:uiPriority w:val="11"/>
     <w:qFormat/>
     <w:rsid w:val="001576E7"/>
@@ -2857,10 +4461,10 @@
       <w:szCs w:val="28"/>
     </w:rPr>
   </w:style>
-  <w:style w:type="character" w:customStyle="1" w:styleId="SubtitleChar">
-    <w:name w:val="Subtitle Char"/>
-    <w:basedOn w:val="DefaultParagraphFont"/>
-    <w:link w:val="Subtitle"/>
+  <w:style w:type="character" w:customStyle="1" w:styleId="SubttuloCar">
+    <w:name w:val="Subtítulo Car"/>
+    <w:basedOn w:val="Fuentedeprrafopredeter"/>
+    <w:link w:val="Subttulo"/>
     <w:uiPriority w:val="11"/>
     <w:rsid w:val="001576E7"/>
     <w:rPr>
@@ -2871,11 +4475,11 @@
       <w:szCs w:val="28"/>
     </w:rPr>
   </w:style>
-  <w:style w:type="paragraph" w:styleId="Quote">
+  <w:style w:type="paragraph" w:styleId="Cita">
     <w:name w:val="Quote"/>
     <w:basedOn w:val="Normal"/>
     <w:next w:val="Normal"/>
-    <w:link w:val="QuoteChar"/>
+    <w:link w:val="CitaCar"/>
     <w:uiPriority w:val="29"/>
     <w:qFormat/>
     <w:rsid w:val="001576E7"/>
@@ -2889,10 +4493,10 @@
       <w:color w:val="404040" w:themeColor="text1" w:themeTint="BF"/>
     </w:rPr>
   </w:style>
-  <w:style w:type="character" w:customStyle="1" w:styleId="QuoteChar">
-    <w:name w:val="Quote Char"/>
-    <w:basedOn w:val="DefaultParagraphFont"/>
-    <w:link w:val="Quote"/>
+  <w:style w:type="character" w:customStyle="1" w:styleId="CitaCar">
+    <w:name w:val="Cita Car"/>
+    <w:basedOn w:val="Fuentedeprrafopredeter"/>
+    <w:link w:val="Cita"/>
     <w:uiPriority w:val="29"/>
     <w:rsid w:val="001576E7"/>
     <w:rPr>
@@ -2901,7 +4505,7 @@
       <w:color w:val="404040" w:themeColor="text1" w:themeTint="BF"/>
     </w:rPr>
   </w:style>
-  <w:style w:type="paragraph" w:styleId="ListParagraph">
+  <w:style w:type="paragraph" w:styleId="Prrafodelista">
     <w:name w:val="List Paragraph"/>
     <w:basedOn w:val="Normal"/>
     <w:uiPriority w:val="34"/>
@@ -2912,9 +4516,9 @@
       <w:contextualSpacing/>
     </w:pPr>
   </w:style>
-  <w:style w:type="character" w:styleId="IntenseEmphasis">
+  <w:style w:type="character" w:styleId="nfasisintenso">
     <w:name w:val="Intense Emphasis"/>
-    <w:basedOn w:val="DefaultParagraphFont"/>
+    <w:basedOn w:val="Fuentedeprrafopredeter"/>
     <w:uiPriority w:val="21"/>
     <w:qFormat/>
     <w:rsid w:val="001576E7"/>
@@ -2924,11 +4528,11 @@
       <w:color w:val="0F4761" w:themeColor="accent1" w:themeShade="BF"/>
     </w:rPr>
   </w:style>
-  <w:style w:type="paragraph" w:styleId="IntenseQuote">
+  <w:style w:type="paragraph" w:styleId="Citadestacada">
     <w:name w:val="Intense Quote"/>
     <w:basedOn w:val="Normal"/>
     <w:next w:val="Normal"/>
-    <w:link w:val="IntenseQuoteChar"/>
+    <w:link w:val="CitadestacadaCar"/>
     <w:uiPriority w:val="30"/>
     <w:qFormat/>
     <w:rsid w:val="001576E7"/>
@@ -2947,10 +4551,10 @@
       <w:color w:val="0F4761" w:themeColor="accent1" w:themeShade="BF"/>
     </w:rPr>
   </w:style>
-  <w:style w:type="character" w:customStyle="1" w:styleId="IntenseQuoteChar">
-    <w:name w:val="Intense Quote Char"/>
-    <w:basedOn w:val="DefaultParagraphFont"/>
-    <w:link w:val="IntenseQuote"/>
+  <w:style w:type="character" w:customStyle="1" w:styleId="CitadestacadaCar">
+    <w:name w:val="Cita destacada Car"/>
+    <w:basedOn w:val="Fuentedeprrafopredeter"/>
+    <w:link w:val="Citadestacada"/>
     <w:uiPriority w:val="30"/>
     <w:rsid w:val="001576E7"/>
     <w:rPr>
@@ -2959,9 +4563,9 @@
       <w:color w:val="0F4761" w:themeColor="accent1" w:themeShade="BF"/>
     </w:rPr>
   </w:style>
-  <w:style w:type="character" w:styleId="IntenseReference">
+  <w:style w:type="character" w:styleId="Referenciaintensa">
     <w:name w:val="Intense Reference"/>
-    <w:basedOn w:val="DefaultParagraphFont"/>
+    <w:basedOn w:val="Fuentedeprrafopredeter"/>
     <w:uiPriority w:val="32"/>
     <w:qFormat/>
     <w:rsid w:val="001576E7"/>
@@ -2973,9 +4577,9 @@
       <w:spacing w:val="5"/>
     </w:rPr>
   </w:style>
-  <w:style w:type="paragraph" w:styleId="TOCHeading">
+  <w:style w:type="paragraph" w:styleId="TtuloTDC">
     <w:name w:val="TOC Heading"/>
-    <w:basedOn w:val="Heading1"/>
+    <w:basedOn w:val="Ttulo1"/>
     <w:next w:val="Normal"/>
     <w:uiPriority w:val="39"/>
     <w:unhideWhenUsed/>
@@ -2992,7 +4596,7 @@
       <w14:ligatures w14:val="none"/>
     </w:rPr>
   </w:style>
-  <w:style w:type="paragraph" w:styleId="TOC1">
+  <w:style w:type="paragraph" w:styleId="TDC1">
     <w:name w:val="toc 1"/>
     <w:basedOn w:val="Normal"/>
     <w:next w:val="Normal"/>
@@ -3004,9 +4608,9 @@
       <w:spacing w:after="100"/>
     </w:pPr>
   </w:style>
-  <w:style w:type="character" w:styleId="Hyperlink">
+  <w:style w:type="character" w:styleId="Hipervnculo">
     <w:name w:val="Hyperlink"/>
-    <w:basedOn w:val="DefaultParagraphFont"/>
+    <w:basedOn w:val="Fuentedeprrafopredeter"/>
     <w:uiPriority w:val="99"/>
     <w:unhideWhenUsed/>
     <w:rsid w:val="008C29E6"/>
@@ -3015,7 +4619,7 @@
       <w:u w:val="single"/>
     </w:rPr>
   </w:style>
-  <w:style w:type="paragraph" w:styleId="TOC2">
+  <w:style w:type="paragraph" w:styleId="TDC2">
     <w:name w:val="toc 2"/>
     <w:basedOn w:val="Normal"/>
     <w:next w:val="Normal"/>
@@ -3028,7 +4632,7 @@
       <w:ind w:left="240"/>
     </w:pPr>
   </w:style>
-  <w:style w:type="paragraph" w:styleId="TOC3">
+  <w:style w:type="paragraph" w:styleId="TDC3">
     <w:name w:val="toc 3"/>
     <w:basedOn w:val="Normal"/>
     <w:next w:val="Normal"/>
@@ -3041,9 +4645,9 @@
       <w:ind w:left="480"/>
     </w:pPr>
   </w:style>
-  <w:style w:type="character" w:styleId="UnresolvedMention">
+  <w:style w:type="character" w:styleId="Mencinsinresolver">
     <w:name w:val="Unresolved Mention"/>
-    <w:basedOn w:val="DefaultParagraphFont"/>
+    <w:basedOn w:val="Fuentedeprrafopredeter"/>
     <w:uiPriority w:val="99"/>
     <w:semiHidden/>
     <w:unhideWhenUsed/>
@@ -3052,6 +4656,19 @@
       <w:color w:val="605E5C"/>
       <w:shd w:val="clear" w:color="auto" w:fill="E1DFDD"/>
     </w:rPr>
+  </w:style>
+  <w:style w:type="paragraph" w:styleId="Listaconvietas">
+    <w:name w:val="List Bullet"/>
+    <w:basedOn w:val="Normal"/>
+    <w:uiPriority w:val="99"/>
+    <w:unhideWhenUsed/>
+    <w:rsid w:val="00BA096B"/>
+    <w:pPr>
+      <w:numPr>
+        <w:numId w:val="9"/>
+      </w:numPr>
+      <w:contextualSpacing/>
+    </w:pPr>
   </w:style>
 </w:styles>
 </file>

</xml_diff>